<commit_message>
Update SchoolSM [30/08/2026 10:04:23.44]
</commit_message>
<xml_diff>
--- a/New Microsoft Word Document.docx
+++ b/New Microsoft Word Document.docx
@@ -100,7 +100,7 @@
     <w:p>
       <w:r>
         <w:pict w14:anchorId="266711CC">
-          <v:rect id="_x0000_i1055" style="width:403.05pt;height:.75pt" o:hrpct="0" o:hralign="center" o:hrstd="t" o:hr="t" fillcolor="#a0a0a0" stroked="f"/>
+          <v:rect id="_x0000_i1025" style="width:403.05pt;height:.75pt" o:hrpct="0" o:hralign="center" o:hrstd="t" o:hr="t" fillcolor="#a0a0a0" stroked="f"/>
         </w:pict>
       </w:r>
     </w:p>
@@ -351,7 +351,7 @@
     <w:p>
       <w:r>
         <w:pict w14:anchorId="5B228B4F">
-          <v:rect id="_x0000_i1056" style="width:403.05pt;height:.75pt" o:hrpct="0" o:hralign="center" o:hrstd="t" o:hr="t" fillcolor="#a0a0a0" stroked="f"/>
+          <v:rect id="_x0000_i1026" style="width:403.05pt;height:.75pt" o:hrpct="0" o:hralign="center" o:hrstd="t" o:hr="t" fillcolor="#a0a0a0" stroked="f"/>
         </w:pict>
       </w:r>
     </w:p>
@@ -523,7 +523,7 @@
     <w:p>
       <w:r>
         <w:pict w14:anchorId="57474B7C">
-          <v:rect id="_x0000_i1057" style="width:403.05pt;height:.75pt" o:hrpct="0" o:hralign="center" o:hrstd="t" o:hr="t" fillcolor="#a0a0a0" stroked="f"/>
+          <v:rect id="_x0000_i1027" style="width:403.05pt;height:.75pt" o:hrpct="0" o:hralign="center" o:hrstd="t" o:hr="t" fillcolor="#a0a0a0" stroked="f"/>
         </w:pict>
       </w:r>
     </w:p>
@@ -648,7 +648,7 @@
     <w:p>
       <w:r>
         <w:pict w14:anchorId="6527C290">
-          <v:rect id="_x0000_i1058" style="width:403.05pt;height:.75pt" o:hrpct="0" o:hralign="center" o:hrstd="t" o:hr="t" fillcolor="#a0a0a0" stroked="f"/>
+          <v:rect id="_x0000_i1028" style="width:403.05pt;height:.75pt" o:hrpct="0" o:hralign="center" o:hrstd="t" o:hr="t" fillcolor="#a0a0a0" stroked="f"/>
         </w:pict>
       </w:r>
     </w:p>
@@ -778,7 +778,7 @@
     <w:p>
       <w:r>
         <w:pict w14:anchorId="41600B71">
-          <v:rect id="_x0000_i1059" style="width:403.05pt;height:.75pt" o:hrpct="0" o:hralign="center" o:hrstd="t" o:hr="t" fillcolor="#a0a0a0" stroked="f"/>
+          <v:rect id="_x0000_i1029" style="width:403.05pt;height:.75pt" o:hrpct="0" o:hralign="center" o:hrstd="t" o:hr="t" fillcolor="#a0a0a0" stroked="f"/>
         </w:pict>
       </w:r>
     </w:p>
@@ -1164,6 +1164,2758 @@
         </w:tc>
       </w:tr>
     </w:tbl>
+    <w:p>
+      <w:pPr>
+        <w:rPr>
+          <w:cs/>
+        </w:rPr>
+      </w:pPr>
+    </w:p>
+    <w:p>
+      <w:pPr>
+        <w:rPr>
+          <w:cs/>
+        </w:rPr>
+      </w:pPr>
+      <w:r>
+        <w:rPr>
+          <w:cs/>
+        </w:rPr>
+        <w:br w:type="page"/>
+      </w:r>
+    </w:p>
+    <w:p>
+      <w:r>
+        <w:rPr>
+          <w:cs/>
+        </w:rPr>
+        <w:lastRenderedPageBreak/>
+        <w:t>ខាងក្រោមនេះជាការពន្យល់លម្អិតអំពី</w:t>
+      </w:r>
+      <w:r>
+        <w:t> </w:t>
+      </w:r>
+      <w:r>
+        <w:rPr>
+          <w:b/>
+          <w:bCs/>
+          <w:cs/>
+        </w:rPr>
+        <w:t>ដំណើរការទាំង ៣ នៃការគ្រប់គ្រងទិន្នន័យ (</w:t>
+      </w:r>
+      <w:r>
+        <w:rPr>
+          <w:b/>
+          <w:bCs/>
+        </w:rPr>
+        <w:t>Database Backup)</w:t>
+      </w:r>
+      <w:r>
+        <w:t> </w:t>
+      </w:r>
+      <w:r>
+        <w:rPr>
+          <w:cs/>
+        </w:rPr>
+        <w:t>និង</w:t>
+      </w:r>
+      <w:r>
+        <w:t> </w:t>
+      </w:r>
+      <w:r>
+        <w:rPr>
+          <w:b/>
+          <w:bCs/>
+          <w:cs/>
+        </w:rPr>
+        <w:t xml:space="preserve">ការណែនាំជាជំហានៗក្នុងការបង្កើត </w:t>
+      </w:r>
+      <w:r>
+        <w:rPr>
+          <w:b/>
+          <w:bCs/>
+        </w:rPr>
+        <w:t>Telegram Bot</w:t>
+      </w:r>
+      <w:r>
+        <w:t> </w:t>
+      </w:r>
+      <w:r>
+        <w:rPr>
+          <w:cs/>
+        </w:rPr>
+        <w:t xml:space="preserve">សម្រាប់ប្រព័ន្ធ </w:t>
+      </w:r>
+      <w:r>
+        <w:t>SchoolSM</w:t>
+      </w:r>
+      <w:r>
+        <w:rPr>
+          <w:cs/>
+        </w:rPr>
+        <w:t>៖</w:t>
+      </w:r>
+    </w:p>
+    <w:p>
+      <w:r>
+        <w:pict w14:anchorId="3EE484E2">
+          <v:rect id="_x0000_i1072" style="width:403.05pt;height:.75pt" o:hrpct="0" o:hralign="center" o:hrstd="t" o:hr="t" fillcolor="#a0a0a0" stroked="f"/>
+        </w:pict>
+      </w:r>
+    </w:p>
+    <w:p>
+      <w:pPr>
+        <w:rPr>
+          <w:b/>
+          <w:bCs/>
+        </w:rPr>
+      </w:pPr>
+      <w:r>
+        <w:rPr>
+          <w:b/>
+          <w:bCs/>
+          <w:cs/>
+        </w:rPr>
+        <w:t xml:space="preserve">ផ្នែកទី ១៖ ការពន្យល់ដំណើរការទាំង ៣ នៃការ </w:t>
+      </w:r>
+      <w:r>
+        <w:rPr>
+          <w:b/>
+          <w:bCs/>
+        </w:rPr>
+        <w:t>Backup &amp; Restore</w:t>
+      </w:r>
+    </w:p>
+    <w:p>
+      <w:r>
+        <w:t xml:space="preserve">                       </w:t>
+      </w:r>
+      <w:r>
+        <w:rPr>
+          <w:rFonts w:ascii="MS Mincho" w:eastAsia="MS Mincho" w:hAnsi="MS Mincho" w:cs="MS Mincho" w:hint="eastAsia"/>
+        </w:rPr>
+        <w:t>┌───────────────────────────────┐</w:t>
+      </w:r>
+    </w:p>
+    <w:p>
+      <w:r>
+        <w:t xml:space="preserve">                       </w:t>
+      </w:r>
+      <w:r>
+        <w:rPr>
+          <w:rFonts w:ascii="MS Mincho" w:eastAsia="MS Mincho" w:hAnsi="MS Mincho" w:cs="MS Mincho" w:hint="eastAsia"/>
+        </w:rPr>
+        <w:t>│</w:t>
+      </w:r>
+      <w:r>
+        <w:t xml:space="preserve"> </w:t>
+      </w:r>
+      <w:r>
+        <w:rPr>
+          <w:rFonts w:ascii="Segoe UI Emoji" w:hAnsi="Segoe UI Emoji" w:cs="Segoe UI Emoji"/>
+        </w:rPr>
+        <w:t>📊</w:t>
+      </w:r>
+      <w:r>
+        <w:t xml:space="preserve"> </w:t>
+      </w:r>
+      <w:r>
+        <w:rPr>
+          <w:cs/>
+        </w:rPr>
+        <w:t>ទិន្នន័យបច្ចុប្បន្ន (</w:t>
+      </w:r>
+      <w:r>
+        <w:t xml:space="preserve">Live DB) </w:t>
+      </w:r>
+      <w:r>
+        <w:rPr>
+          <w:rFonts w:ascii="MS Mincho" w:eastAsia="MS Mincho" w:hAnsi="MS Mincho" w:cs="MS Mincho" w:hint="eastAsia"/>
+        </w:rPr>
+        <w:t>│</w:t>
+      </w:r>
+    </w:p>
+    <w:p>
+      <w:r>
+        <w:t xml:space="preserve">                       </w:t>
+      </w:r>
+      <w:r>
+        <w:rPr>
+          <w:rFonts w:ascii="MS Mincho" w:eastAsia="MS Mincho" w:hAnsi="MS Mincho" w:cs="MS Mincho" w:hint="eastAsia"/>
+        </w:rPr>
+        <w:t>└──────┬─────────────────▲──────┘</w:t>
+      </w:r>
+    </w:p>
+    <w:p>
+      <w:r>
+        <w:t xml:space="preserve">      </w:t>
+      </w:r>
+      <w:r>
+        <w:rPr>
+          <w:cs/>
+        </w:rPr>
+        <w:t xml:space="preserve">១. បង្កើត </w:t>
+      </w:r>
+      <w:r>
+        <w:t xml:space="preserve">Snapshot </w:t>
+      </w:r>
+      <w:r>
+        <w:rPr>
+          <w:cs/>
+        </w:rPr>
+        <w:t xml:space="preserve">ភ្លាមៗ </w:t>
+      </w:r>
+      <w:r>
+        <w:rPr>
+          <w:rFonts w:ascii="MS Mincho" w:eastAsia="MS Mincho" w:hAnsi="MS Mincho" w:cs="MS Mincho" w:hint="eastAsia"/>
+          <w:cs/>
+        </w:rPr>
+        <w:t>│</w:t>
+      </w:r>
+      <w:r>
+        <w:t xml:space="preserve">                 </w:t>
+      </w:r>
+      <w:r>
+        <w:rPr>
+          <w:rFonts w:ascii="MS Mincho" w:eastAsia="MS Mincho" w:hAnsi="MS Mincho" w:cs="MS Mincho" w:hint="eastAsia"/>
+        </w:rPr>
+        <w:t>│</w:t>
+      </w:r>
+      <w:r>
+        <w:t xml:space="preserve"> </w:t>
+      </w:r>
+      <w:r>
+        <w:rPr>
+          <w:cs/>
+        </w:rPr>
+        <w:t>៣. ស្តារឡើងវិញ (</w:t>
+      </w:r>
+      <w:r>
+        <w:t>1-Click Restore)</w:t>
+      </w:r>
+    </w:p>
+    <w:p>
+      <w:r>
+        <w:t xml:space="preserve">                              </w:t>
+      </w:r>
+      <w:r>
+        <w:rPr>
+          <w:rFonts w:ascii="Times New Roman" w:hAnsi="Times New Roman" w:cs="Times New Roman"/>
+        </w:rPr>
+        <w:t>▼</w:t>
+      </w:r>
+      <w:r>
+        <w:t xml:space="preserve">                 </w:t>
+      </w:r>
+      <w:r>
+        <w:rPr>
+          <w:rFonts w:ascii="MS Mincho" w:eastAsia="MS Mincho" w:hAnsi="MS Mincho" w:cs="MS Mincho" w:hint="eastAsia"/>
+        </w:rPr>
+        <w:t>│</w:t>
+      </w:r>
+    </w:p>
+    <w:p>
+      <w:r>
+        <w:t xml:space="preserve">                       </w:t>
+      </w:r>
+      <w:r>
+        <w:rPr>
+          <w:rFonts w:ascii="MS Mincho" w:eastAsia="MS Mincho" w:hAnsi="MS Mincho" w:cs="MS Mincho" w:hint="eastAsia"/>
+        </w:rPr>
+        <w:t>┌────────────────────────┴──────┐</w:t>
+      </w:r>
+    </w:p>
+    <w:p>
+      <w:r>
+        <w:t xml:space="preserve">                       </w:t>
+      </w:r>
+      <w:r>
+        <w:rPr>
+          <w:rFonts w:ascii="MS Mincho" w:eastAsia="MS Mincho" w:hAnsi="MS Mincho" w:cs="MS Mincho" w:hint="eastAsia"/>
+        </w:rPr>
+        <w:t>│</w:t>
+      </w:r>
+      <w:r>
+        <w:t xml:space="preserve"> </w:t>
+      </w:r>
+      <w:r>
+        <w:rPr>
+          <w:rFonts w:ascii="Segoe UI Emoji" w:hAnsi="Segoe UI Emoji" w:cs="Segoe UI Emoji"/>
+        </w:rPr>
+        <w:t>📁</w:t>
+      </w:r>
+      <w:r>
+        <w:t xml:space="preserve"> </w:t>
+      </w:r>
+      <w:r>
+        <w:rPr>
+          <w:cs/>
+        </w:rPr>
+        <w:t xml:space="preserve">ឃ្លាំងផ្ទុក </w:t>
+      </w:r>
+      <w:r>
+        <w:t xml:space="preserve">File Backup      </w:t>
+      </w:r>
+      <w:r>
+        <w:rPr>
+          <w:rFonts w:ascii="MS Mincho" w:eastAsia="MS Mincho" w:hAnsi="MS Mincho" w:cs="MS Mincho" w:hint="eastAsia"/>
+        </w:rPr>
+        <w:t>│</w:t>
+      </w:r>
+    </w:p>
+    <w:p>
+      <w:r>
+        <w:t xml:space="preserve">                       </w:t>
+      </w:r>
+      <w:r>
+        <w:rPr>
+          <w:rFonts w:ascii="MS Mincho" w:eastAsia="MS Mincho" w:hAnsi="MS Mincho" w:cs="MS Mincho" w:hint="eastAsia"/>
+        </w:rPr>
+        <w:t>└──────────────┬────────────────┘</w:t>
+      </w:r>
+    </w:p>
+    <w:p>
+      <w:r>
+        <w:t xml:space="preserve">                                      </w:t>
+      </w:r>
+      <w:r>
+        <w:rPr>
+          <w:rFonts w:ascii="MS Mincho" w:eastAsia="MS Mincho" w:hAnsi="MS Mincho" w:cs="MS Mincho" w:hint="eastAsia"/>
+        </w:rPr>
+        <w:t>│</w:t>
+      </w:r>
+      <w:r>
+        <w:t xml:space="preserve"> </w:t>
+      </w:r>
+      <w:r>
+        <w:rPr>
+          <w:cs/>
+        </w:rPr>
+        <w:t>២. ទាញយក (</w:t>
+      </w:r>
+      <w:r>
+        <w:t>Download)</w:t>
+      </w:r>
+    </w:p>
+    <w:p>
+      <w:r>
+        <w:t xml:space="preserve">                                      </w:t>
+      </w:r>
+      <w:r>
+        <w:rPr>
+          <w:rFonts w:ascii="Times New Roman" w:hAnsi="Times New Roman" w:cs="Times New Roman"/>
+        </w:rPr>
+        <w:t>▼</w:t>
+      </w:r>
+    </w:p>
+    <w:p>
+      <w:r>
+        <w:t xml:space="preserve">                       </w:t>
+      </w:r>
+      <w:r>
+        <w:rPr>
+          <w:rFonts w:ascii="MS Mincho" w:eastAsia="MS Mincho" w:hAnsi="MS Mincho" w:cs="MS Mincho" w:hint="eastAsia"/>
+        </w:rPr>
+        <w:t>┌───────────────────────────────┐</w:t>
+      </w:r>
+    </w:p>
+    <w:p>
+      <w:r>
+        <w:t xml:space="preserve">                       </w:t>
+      </w:r>
+      <w:r>
+        <w:rPr>
+          <w:rFonts w:ascii="MS Mincho" w:eastAsia="MS Mincho" w:hAnsi="MS Mincho" w:cs="MS Mincho" w:hint="eastAsia"/>
+        </w:rPr>
+        <w:t>│</w:t>
+      </w:r>
+      <w:r>
+        <w:t xml:space="preserve"> </w:t>
+      </w:r>
+      <w:r>
+        <w:rPr>
+          <w:rFonts w:ascii="Segoe UI Emoji" w:hAnsi="Segoe UI Emoji" w:cs="Segoe UI Emoji"/>
+        </w:rPr>
+        <w:t>💻</w:t>
+      </w:r>
+      <w:r>
+        <w:t xml:space="preserve"> </w:t>
+      </w:r>
+      <w:r>
+        <w:rPr>
+          <w:cs/>
+        </w:rPr>
+        <w:t xml:space="preserve">កុំព្យូទ័រផ្ទាល់ខ្លួនរបស់ </w:t>
+      </w:r>
+      <w:r>
+        <w:t xml:space="preserve">Admin </w:t>
+      </w:r>
+      <w:r>
+        <w:rPr>
+          <w:rFonts w:ascii="MS Mincho" w:eastAsia="MS Mincho" w:hAnsi="MS Mincho" w:cs="MS Mincho" w:hint="eastAsia"/>
+        </w:rPr>
+        <w:t>│</w:t>
+      </w:r>
+    </w:p>
+    <w:p>
+      <w:pPr>
+        <w:rPr>
+          <w:rFonts w:ascii="MS Mincho" w:eastAsia="MS Mincho" w:hAnsi="MS Mincho" w:cs="MS Mincho"/>
+        </w:rPr>
+      </w:pPr>
+      <w:r>
+        <w:t xml:space="preserve">                       </w:t>
+      </w:r>
+      <w:r>
+        <w:rPr>
+          <w:rFonts w:ascii="MS Mincho" w:eastAsia="MS Mincho" w:hAnsi="MS Mincho" w:cs="MS Mincho" w:hint="eastAsia"/>
+        </w:rPr>
+        <w:t>└───────────────────────────────┘</w:t>
+      </w:r>
+    </w:p>
+    <w:p>
+      <w:r>
+        <w:rPr>
+          <w:cs/>
+        </w:rPr>
+        <w:lastRenderedPageBreak/>
+        <w:drawing>
+          <wp:inline distT="0" distB="0" distL="0" distR="0" wp14:anchorId="2EF8BBA6" wp14:editId="1743A853">
+            <wp:extent cx="5082980" cy="3048264"/>
+            <wp:effectExtent l="0" t="0" r="3810" b="0"/>
+            <wp:docPr id="2139498166" name="Picture 1"/>
+            <wp:cNvGraphicFramePr>
+              <a:graphicFrameLocks xmlns:a="http://schemas.openxmlformats.org/drawingml/2006/main" noChangeAspect="1"/>
+            </wp:cNvGraphicFramePr>
+            <a:graphic xmlns:a="http://schemas.openxmlformats.org/drawingml/2006/main">
+              <a:graphicData uri="http://schemas.openxmlformats.org/drawingml/2006/picture">
+                <pic:pic xmlns:pic="http://schemas.openxmlformats.org/drawingml/2006/picture">
+                  <pic:nvPicPr>
+                    <pic:cNvPr id="2139498166" name=""/>
+                    <pic:cNvPicPr/>
+                  </pic:nvPicPr>
+                  <pic:blipFill>
+                    <a:blip r:embed="rId5"/>
+                    <a:stretch>
+                      <a:fillRect/>
+                    </a:stretch>
+                  </pic:blipFill>
+                  <pic:spPr>
+                    <a:xfrm>
+                      <a:off x="0" y="0"/>
+                      <a:ext cx="5082980" cy="3048264"/>
+                    </a:xfrm>
+                    <a:prstGeom prst="rect">
+                      <a:avLst/>
+                    </a:prstGeom>
+                  </pic:spPr>
+                </pic:pic>
+              </a:graphicData>
+            </a:graphic>
+          </wp:inline>
+        </w:drawing>
+      </w:r>
+    </w:p>
+    <w:p>
+      <w:r>
+        <w:rPr>
+          <w:cs/>
+        </w:rPr>
+        <w:t xml:space="preserve">១. បង្កើត </w:t>
+      </w:r>
+      <w:r>
+        <w:t xml:space="preserve">Snapshot </w:t>
+      </w:r>
+      <w:r>
+        <w:rPr>
+          <w:cs/>
+        </w:rPr>
+        <w:t>ភ្លាមៗ (</w:t>
+      </w:r>
+      <w:r>
+        <w:t>Manual Backup)</w:t>
+      </w:r>
+    </w:p>
+    <w:p>
+      <w:pPr>
+        <w:numPr>
+          <w:ilvl w:val="0"/>
+          <w:numId w:val="5"/>
+        </w:numPr>
+      </w:pPr>
+      <w:r>
+        <w:rPr>
+          <w:b/>
+          <w:bCs/>
+          <w:cs/>
+        </w:rPr>
+        <w:t>គោលបំណង</w:t>
+      </w:r>
+      <w:r>
+        <w:rPr>
+          <w:cs/>
+        </w:rPr>
+        <w:t>៖ ប្រើសម្រាប់ថតចម្លងស្ថានភាពទិន្នន័យសាលាទាំងអស់ (សិស្ស</w:t>
+      </w:r>
+      <w:r>
+        <w:t xml:space="preserve">, </w:t>
+      </w:r>
+      <w:r>
+        <w:rPr>
+          <w:cs/>
+        </w:rPr>
+        <w:t>គ្រូ</w:t>
+      </w:r>
+      <w:r>
+        <w:t xml:space="preserve">, </w:t>
+      </w:r>
+      <w:r>
+        <w:rPr>
+          <w:cs/>
+        </w:rPr>
+        <w:t>កាលវិភាគ</w:t>
+      </w:r>
+      <w:r>
+        <w:t xml:space="preserve">, </w:t>
+      </w:r>
+      <w:r>
+        <w:rPr>
+          <w:cs/>
+        </w:rPr>
+        <w:t>ពិន្ទុ</w:t>
+      </w:r>
+      <w:r>
+        <w:t xml:space="preserve">, </w:t>
+      </w:r>
+      <w:r>
+        <w:rPr>
+          <w:cs/>
+        </w:rPr>
+        <w:t xml:space="preserve">វត្តមាន) នៅវិនាទីនោះ ទុកជា </w:t>
+      </w:r>
+      <w:r>
+        <w:t xml:space="preserve">File Backup </w:t>
+      </w:r>
+      <w:r>
+        <w:rPr>
+          <w:cs/>
+        </w:rPr>
+        <w:t>ភ្លាមៗ។</w:t>
+      </w:r>
+    </w:p>
+    <w:p>
+      <w:pPr>
+        <w:numPr>
+          <w:ilvl w:val="0"/>
+          <w:numId w:val="5"/>
+        </w:numPr>
+      </w:pPr>
+      <w:r>
+        <w:rPr>
+          <w:b/>
+          <w:bCs/>
+          <w:cs/>
+        </w:rPr>
+        <w:t>ពេលណាដែលត្រូវប្រើ</w:t>
+      </w:r>
+      <w:r>
+        <w:rPr>
+          <w:cs/>
+        </w:rPr>
+        <w:t xml:space="preserve">៖ មុនពេល </w:t>
+      </w:r>
+      <w:r>
+        <w:t xml:space="preserve">Admin </w:t>
+      </w:r>
+      <w:r>
+        <w:rPr>
+          <w:cs/>
+        </w:rPr>
+        <w:t>ធ្វើការកែប្រែទិន្នន័យធំៗ (</w:t>
+      </w:r>
+      <w:r>
+        <w:t xml:space="preserve">Bulk Delete, </w:t>
+      </w:r>
+      <w:r>
+        <w:rPr>
+          <w:cs/>
+        </w:rPr>
+        <w:t>ផ្លាស់ប្តូរឆ្នាំសិក្សា</w:t>
+      </w:r>
+      <w:r>
+        <w:t xml:space="preserve">, </w:t>
+      </w:r>
+      <w:r>
+        <w:rPr>
+          <w:cs/>
+        </w:rPr>
+        <w:t xml:space="preserve">បញ្ចូលបញ្ជីសិស្សច្រើនតាម </w:t>
+      </w:r>
+      <w:r>
+        <w:t xml:space="preserve">Excel, </w:t>
+      </w:r>
+      <w:r>
+        <w:rPr>
+          <w:cs/>
+        </w:rPr>
+        <w:t xml:space="preserve">ឬ </w:t>
+      </w:r>
+      <w:r>
+        <w:t xml:space="preserve">Upgrade </w:t>
+      </w:r>
+      <w:r>
+        <w:rPr>
+          <w:cs/>
+        </w:rPr>
+        <w:t>ប្រព័ន្ធ)។</w:t>
+      </w:r>
+    </w:p>
+    <w:p>
+      <w:pPr>
+        <w:numPr>
+          <w:ilvl w:val="0"/>
+          <w:numId w:val="5"/>
+        </w:numPr>
+      </w:pPr>
+      <w:r>
+        <w:rPr>
+          <w:b/>
+          <w:bCs/>
+          <w:cs/>
+        </w:rPr>
+        <w:t>របៀបដំណើរការ</w:t>
+      </w:r>
+      <w:r>
+        <w:rPr>
+          <w:cs/>
+        </w:rPr>
+        <w:t>៖</w:t>
+      </w:r>
+    </w:p>
+    <w:p>
+      <w:pPr>
+        <w:numPr>
+          <w:ilvl w:val="1"/>
+          <w:numId w:val="5"/>
+        </w:numPr>
+      </w:pPr>
+      <w:r>
+        <w:t xml:space="preserve">Admin </w:t>
+      </w:r>
+      <w:r>
+        <w:rPr>
+          <w:cs/>
+        </w:rPr>
+        <w:t>ចូលទៅកាន់ម៉ឺនុយ</w:t>
+      </w:r>
+      <w:r>
+        <w:t> </w:t>
+      </w:r>
+      <w:r>
+        <w:rPr>
+          <w:b/>
+          <w:bCs/>
+          <w:cs/>
+        </w:rPr>
+        <w:t>ឧបករណ៍ឌីជីថល (</w:t>
+      </w:r>
+      <w:r>
+        <w:rPr>
+          <w:b/>
+          <w:bCs/>
+        </w:rPr>
+        <w:t xml:space="preserve">Online Tools) </w:t>
+      </w:r>
+      <w:r>
+        <w:rPr>
+          <w:rFonts w:ascii="Arial Unicode MS" w:eastAsia="Arial Unicode MS" w:hAnsi="Arial Unicode MS" w:cs="Arial Unicode MS" w:hint="eastAsia"/>
+          <w:b/>
+          <w:bCs/>
+        </w:rPr>
+        <w:t>➔</w:t>
+      </w:r>
+      <w:r>
+        <w:rPr>
+          <w:b/>
+          <w:bCs/>
+        </w:rPr>
+        <w:t xml:space="preserve"> Database Backup &amp; Snapshot</w:t>
+      </w:r>
+      <w:r>
+        <w:t> (/tools/database-backup/)</w:t>
+      </w:r>
+      <w:r>
+        <w:rPr>
+          <w:cs/>
+        </w:rPr>
+        <w:t>។</w:t>
+      </w:r>
+    </w:p>
+    <w:p>
+      <w:pPr>
+        <w:numPr>
+          <w:ilvl w:val="1"/>
+          <w:numId w:val="5"/>
+        </w:numPr>
+      </w:pPr>
+      <w:r>
+        <w:rPr>
+          <w:cs/>
+        </w:rPr>
+        <w:t>វាយបញ្ចូលចំណាំ (</w:t>
+      </w:r>
+      <w:r>
+        <w:t xml:space="preserve">Label) </w:t>
+      </w:r>
+      <w:r>
+        <w:rPr>
+          <w:cs/>
+        </w:rPr>
+        <w:t>ឧទាហរណ៍៖</w:t>
+      </w:r>
+      <w:r>
+        <w:t> </w:t>
+      </w:r>
+      <w:r>
+        <w:rPr>
+          <w:i/>
+          <w:iCs/>
+        </w:rPr>
+        <w:t>"</w:t>
+      </w:r>
+      <w:r>
+        <w:rPr>
+          <w:i/>
+          <w:iCs/>
+          <w:cs/>
+        </w:rPr>
+        <w:t>មុនពេលប្តូរឆ្នាំសិក្សាថ្មី"</w:t>
+      </w:r>
+      <w:r>
+        <w:t> </w:t>
+      </w:r>
+      <w:r>
+        <w:rPr>
+          <w:cs/>
+        </w:rPr>
+        <w:t>រួចចុច</w:t>
+      </w:r>
+      <w:r>
+        <w:t> </w:t>
+      </w:r>
+      <w:r>
+        <w:rPr>
+          <w:b/>
+          <w:bCs/>
+        </w:rPr>
+        <w:t>"</w:t>
+      </w:r>
+      <w:r>
+        <w:rPr>
+          <w:b/>
+          <w:bCs/>
+          <w:cs/>
+        </w:rPr>
+        <w:t xml:space="preserve">បង្កើត </w:t>
+      </w:r>
+      <w:r>
+        <w:rPr>
+          <w:b/>
+          <w:bCs/>
+        </w:rPr>
+        <w:t xml:space="preserve">Snapshot </w:t>
+      </w:r>
+      <w:r>
+        <w:rPr>
+          <w:b/>
+          <w:bCs/>
+          <w:cs/>
+        </w:rPr>
+        <w:t>ថ្មី"</w:t>
+      </w:r>
+      <w:r>
+        <w:rPr>
+          <w:cs/>
+        </w:rPr>
+        <w:t>។</w:t>
+      </w:r>
+    </w:p>
+    <w:p>
+      <w:pPr>
+        <w:numPr>
+          <w:ilvl w:val="1"/>
+          <w:numId w:val="5"/>
+        </w:numPr>
+      </w:pPr>
+      <w:r>
+        <w:rPr>
+          <w:cs/>
+        </w:rPr>
+        <w:t xml:space="preserve">ប្រព័ន្ធនឹងបង្កើត </w:t>
+      </w:r>
+      <w:r>
+        <w:t>File Backup (.json </w:t>
+      </w:r>
+      <w:r>
+        <w:rPr>
+          <w:cs/>
+        </w:rPr>
+        <w:t>ឬ</w:t>
+      </w:r>
+      <w:r>
+        <w:t xml:space="preserve"> .sqlite3) </w:t>
+      </w:r>
+      <w:r>
+        <w:rPr>
+          <w:cs/>
+        </w:rPr>
+        <w:t>រួមជាមួយព័ត៌មានលម្អិត (កាលបរិច្ឆេទ</w:t>
+      </w:r>
+      <w:r>
+        <w:t xml:space="preserve">, </w:t>
+      </w:r>
+      <w:r>
+        <w:rPr>
+          <w:cs/>
+        </w:rPr>
+        <w:t>ទំហំ</w:t>
+      </w:r>
+      <w:r>
+        <w:t xml:space="preserve">, </w:t>
+      </w:r>
+      <w:r>
+        <w:rPr>
+          <w:cs/>
+        </w:rPr>
+        <w:t xml:space="preserve">ចំនួនទិន្នន័យ) ទៅរក្សាទុកក្នុង </w:t>
+      </w:r>
+      <w:r>
+        <w:t>Folder backups/ </w:t>
+      </w:r>
+      <w:r>
+        <w:rPr>
+          <w:cs/>
+        </w:rPr>
+        <w:t xml:space="preserve">លើ </w:t>
+      </w:r>
+      <w:r>
+        <w:t xml:space="preserve">Server </w:t>
+      </w:r>
+      <w:r>
+        <w:rPr>
+          <w:cs/>
+        </w:rPr>
+        <w:t>ដោយសុវត្ថិភាព។</w:t>
+      </w:r>
+    </w:p>
+    <w:p>
+      <w:r>
+        <w:pict w14:anchorId="5FCAA771">
+          <v:rect id="_x0000_i1073" style="width:403.05pt;height:.75pt" o:hrpct="0" o:hralign="center" o:hrstd="t" o:hr="t" fillcolor="#a0a0a0" stroked="f"/>
+        </w:pict>
+      </w:r>
+    </w:p>
+    <w:p>
+      <w:r>
+        <w:rPr>
+          <w:cs/>
+        </w:rPr>
+        <w:lastRenderedPageBreak/>
+        <w:t>២. ទាញយក (</w:t>
+      </w:r>
+      <w:r>
+        <w:t xml:space="preserve">Download) </w:t>
+      </w:r>
+      <w:r>
+        <w:rPr>
+          <w:cs/>
+        </w:rPr>
+        <w:t xml:space="preserve">ឯកសារ </w:t>
+      </w:r>
+      <w:r>
+        <w:t xml:space="preserve">Backup </w:t>
+      </w:r>
+      <w:r>
+        <w:rPr>
+          <w:cs/>
+        </w:rPr>
+        <w:t>មកកុំព្យូទ័រ</w:t>
+      </w:r>
+    </w:p>
+    <w:p>
+      <w:pPr>
+        <w:numPr>
+          <w:ilvl w:val="0"/>
+          <w:numId w:val="6"/>
+        </w:numPr>
+      </w:pPr>
+      <w:r>
+        <w:rPr>
+          <w:b/>
+          <w:bCs/>
+          <w:cs/>
+        </w:rPr>
+        <w:t>គោលបំណង</w:t>
+      </w:r>
+      <w:r>
+        <w:rPr>
+          <w:cs/>
+        </w:rPr>
+        <w:t xml:space="preserve">៖ រក្សាទុកឯកសារចម្លងក្រៅ </w:t>
+      </w:r>
+      <w:r>
+        <w:t xml:space="preserve">Server (Off-site Offline Copy) </w:t>
+      </w:r>
+      <w:r>
+        <w:rPr>
+          <w:cs/>
+        </w:rPr>
+        <w:t xml:space="preserve">នៅលើ </w:t>
+      </w:r>
+      <w:r>
+        <w:t xml:space="preserve">Hard Drive </w:t>
+      </w:r>
+      <w:r>
+        <w:rPr>
+          <w:cs/>
+        </w:rPr>
+        <w:t xml:space="preserve">ឬ </w:t>
+      </w:r>
+      <w:r>
+        <w:t xml:space="preserve">Flash Drive </w:t>
+      </w:r>
+      <w:r>
+        <w:rPr>
+          <w:cs/>
+        </w:rPr>
+        <w:t xml:space="preserve">ផ្ទាល់ខ្លួនរបស់ </w:t>
+      </w:r>
+      <w:r>
+        <w:t xml:space="preserve">Admin </w:t>
+      </w:r>
+      <w:r>
+        <w:rPr>
+          <w:cs/>
+        </w:rPr>
+        <w:t xml:space="preserve">ដើម្បីការពារក្នុងករណី </w:t>
+      </w:r>
+      <w:r>
+        <w:t xml:space="preserve">Server </w:t>
+      </w:r>
+      <w:r>
+        <w:rPr>
+          <w:cs/>
+        </w:rPr>
+        <w:t>មានបញ្ហាផ្នែករឹង (</w:t>
+      </w:r>
+      <w:r>
+        <w:t xml:space="preserve">Hardware Failure) </w:t>
+      </w:r>
+      <w:r>
+        <w:rPr>
+          <w:cs/>
+        </w:rPr>
+        <w:t>ឬបាត់បង់ការតភ្ជាប់។</w:t>
+      </w:r>
+    </w:p>
+    <w:p>
+      <w:pPr>
+        <w:numPr>
+          <w:ilvl w:val="0"/>
+          <w:numId w:val="6"/>
+        </w:numPr>
+      </w:pPr>
+      <w:r>
+        <w:rPr>
+          <w:b/>
+          <w:bCs/>
+          <w:cs/>
+        </w:rPr>
+        <w:t>របៀបដំណើរការ</w:t>
+      </w:r>
+      <w:r>
+        <w:rPr>
+          <w:cs/>
+        </w:rPr>
+        <w:t>៖</w:t>
+      </w:r>
+    </w:p>
+    <w:p>
+      <w:pPr>
+        <w:numPr>
+          <w:ilvl w:val="1"/>
+          <w:numId w:val="6"/>
+        </w:numPr>
+      </w:pPr>
+      <w:r>
+        <w:rPr>
+          <w:cs/>
+        </w:rPr>
+        <w:t xml:space="preserve">នៅលើតារាងបញ្ជី </w:t>
+      </w:r>
+      <w:r>
+        <w:t xml:space="preserve">Snapshot </w:t>
+      </w:r>
+      <w:r>
+        <w:rPr>
+          <w:cs/>
+        </w:rPr>
+        <w:t>នីមួយៗ មានប៊ូតុង</w:t>
+      </w:r>
+      <w:r>
+        <w:t> </w:t>
+      </w:r>
+      <w:r>
+        <w:rPr>
+          <w:b/>
+          <w:bCs/>
+        </w:rPr>
+        <w:t>"</w:t>
+      </w:r>
+      <w:r>
+        <w:rPr>
+          <w:b/>
+          <w:bCs/>
+          <w:cs/>
+        </w:rPr>
+        <w:t>ទាញយក (</w:t>
+      </w:r>
+      <w:r>
+        <w:rPr>
+          <w:b/>
+          <w:bCs/>
+        </w:rPr>
+        <w:t>Download)"</w:t>
+      </w:r>
+      <w:r>
+        <w:t> (</w:t>
+      </w:r>
+      <w:r>
+        <w:rPr>
+          <w:cs/>
+        </w:rPr>
+        <w:t>រូបសញ្ញា</w:t>
+      </w:r>
+      <w:r>
+        <w:t> )</w:t>
+      </w:r>
+      <w:r>
+        <w:rPr>
+          <w:cs/>
+        </w:rPr>
+        <w:t>។</w:t>
+      </w:r>
+    </w:p>
+    <w:p>
+      <w:pPr>
+        <w:numPr>
+          <w:ilvl w:val="1"/>
+          <w:numId w:val="6"/>
+        </w:numPr>
+      </w:pPr>
+      <w:r>
+        <w:t xml:space="preserve">Admin </w:t>
+      </w:r>
+      <w:r>
+        <w:rPr>
+          <w:cs/>
+        </w:rPr>
+        <w:t xml:space="preserve">អាចចុចទាញយក </w:t>
+      </w:r>
+      <w:r>
+        <w:t xml:space="preserve">Snapshot </w:t>
+      </w:r>
+      <w:r>
+        <w:rPr>
+          <w:cs/>
+        </w:rPr>
+        <w:t>ចាស់ៗណាមួយ ឬចុច</w:t>
+      </w:r>
+      <w:r>
+        <w:t> </w:t>
+      </w:r>
+      <w:r>
+        <w:rPr>
+          <w:b/>
+          <w:bCs/>
+        </w:rPr>
+        <w:t>"</w:t>
+      </w:r>
+      <w:r>
+        <w:rPr>
+          <w:b/>
+          <w:bCs/>
+          <w:cs/>
+        </w:rPr>
+        <w:t xml:space="preserve">ទាញយក </w:t>
+      </w:r>
+      <w:r>
+        <w:rPr>
+          <w:b/>
+          <w:bCs/>
+        </w:rPr>
+        <w:t>Live Database (.json / .sqlite3)"</w:t>
+      </w:r>
+      <w:r>
+        <w:t> </w:t>
+      </w:r>
+      <w:r>
+        <w:rPr>
+          <w:cs/>
+        </w:rPr>
+        <w:t>ពីលើគេបង្អស់។</w:t>
+      </w:r>
+    </w:p>
+    <w:p>
+      <w:pPr>
+        <w:numPr>
+          <w:ilvl w:val="1"/>
+          <w:numId w:val="6"/>
+        </w:numPr>
+      </w:pPr>
+      <w:r>
+        <w:t xml:space="preserve">Browser </w:t>
+      </w:r>
+      <w:r>
+        <w:rPr>
+          <w:cs/>
+        </w:rPr>
+        <w:t xml:space="preserve">នឹង </w:t>
+      </w:r>
+      <w:r>
+        <w:t xml:space="preserve">Download File </w:t>
+      </w:r>
+      <w:r>
+        <w:rPr>
+          <w:cs/>
+        </w:rPr>
+        <w:t>នោះមកកាន់កុំព្យូទ័រភ្លាមៗ។</w:t>
+      </w:r>
+    </w:p>
+    <w:p>
+      <w:r>
+        <w:pict w14:anchorId="7C8695FB">
+          <v:rect id="_x0000_i1074" style="width:403.05pt;height:.75pt" o:hrpct="0" o:hralign="center" o:hrstd="t" o:hr="t" fillcolor="#a0a0a0" stroked="f"/>
+        </w:pict>
+      </w:r>
+    </w:p>
+    <w:p>
+      <w:r>
+        <w:rPr>
+          <w:cs/>
+        </w:rPr>
+        <w:t>៣. ស្តារទិន្នន័យឡើងវិញ (</w:t>
+      </w:r>
+      <w:r>
+        <w:t>1-Click Restore)</w:t>
+      </w:r>
+    </w:p>
+    <w:p>
+      <w:pPr>
+        <w:numPr>
+          <w:ilvl w:val="0"/>
+          <w:numId w:val="7"/>
+        </w:numPr>
+      </w:pPr>
+      <w:r>
+        <w:rPr>
+          <w:b/>
+          <w:bCs/>
+          <w:cs/>
+        </w:rPr>
+        <w:t>គោលបំណង</w:t>
+      </w:r>
+      <w:r>
+        <w:rPr>
+          <w:cs/>
+        </w:rPr>
+        <w:t xml:space="preserve">៖ បង្វិលត្រឡប់ទិន្នន័យប្រព័ន្ធទាំងមូល ទៅកាន់ពេលវេលាដែលបាន </w:t>
+      </w:r>
+      <w:r>
+        <w:t xml:space="preserve">Backup </w:t>
+      </w:r>
+      <w:r>
+        <w:rPr>
+          <w:cs/>
+        </w:rPr>
+        <w:t>ទុកវិញ នៅពេលមានការច្រឡំលុបទិន្នន័យសំខាន់ៗ ឬមានកំហុសបច្ចេកទេស។</w:t>
+      </w:r>
+    </w:p>
+    <w:p>
+      <w:pPr>
+        <w:numPr>
+          <w:ilvl w:val="0"/>
+          <w:numId w:val="7"/>
+        </w:numPr>
+      </w:pPr>
+      <w:r>
+        <w:rPr>
+          <w:b/>
+          <w:bCs/>
+          <w:cs/>
+        </w:rPr>
+        <w:t>ប្រព័ន្ធការពារសុវត្ថិភាពទ្វេដង (</w:t>
+      </w:r>
+      <w:r>
+        <w:rPr>
+          <w:b/>
+          <w:bCs/>
+        </w:rPr>
+        <w:t>Auto Pre-Restore Safety Backup)</w:t>
+      </w:r>
+      <w:r>
+        <w:rPr>
+          <w:cs/>
+        </w:rPr>
+        <w:t>៖</w:t>
+      </w:r>
+    </w:p>
+    <w:p>
+      <w:pPr>
+        <w:numPr>
+          <w:ilvl w:val="1"/>
+          <w:numId w:val="7"/>
+        </w:numPr>
+      </w:pPr>
+      <w:r>
+        <w:rPr>
+          <w:cs/>
+        </w:rPr>
+        <w:t xml:space="preserve">នៅមុនពេល </w:t>
+      </w:r>
+      <w:r>
+        <w:t xml:space="preserve">Restore </w:t>
+      </w:r>
+      <w:r>
+        <w:rPr>
+          <w:cs/>
+        </w:rPr>
+        <w:t xml:space="preserve">ជាន់លើទិន្នន័យបច្ចុប្បន្ន ប្រព័ន្ធ </w:t>
+      </w:r>
+      <w:r>
+        <w:t xml:space="preserve">SchoolSM </w:t>
+      </w:r>
+      <w:r>
+        <w:rPr>
+          <w:cs/>
+        </w:rPr>
+        <w:t>នឹង</w:t>
+      </w:r>
+      <w:r>
+        <w:t> </w:t>
+      </w:r>
+      <w:r>
+        <w:rPr>
+          <w:b/>
+          <w:bCs/>
+          <w:cs/>
+        </w:rPr>
+        <w:t xml:space="preserve">បង្កើត </w:t>
+      </w:r>
+      <w:r>
+        <w:rPr>
+          <w:b/>
+          <w:bCs/>
+        </w:rPr>
+        <w:t xml:space="preserve">Safety Backup </w:t>
+      </w:r>
+      <w:r>
+        <w:rPr>
+          <w:b/>
+          <w:bCs/>
+          <w:cs/>
+        </w:rPr>
+        <w:t xml:space="preserve">ស្វ័យប្រវត្តិនូវទិន្នន័យមុនពេល </w:t>
+      </w:r>
+      <w:r>
+        <w:rPr>
+          <w:b/>
+          <w:bCs/>
+        </w:rPr>
+        <w:t xml:space="preserve">Restore </w:t>
+      </w:r>
+      <w:r>
+        <w:rPr>
+          <w:b/>
+          <w:bCs/>
+          <w:cs/>
+        </w:rPr>
+        <w:t>មួយសិន</w:t>
+      </w:r>
+      <w:r>
+        <w:t> </w:t>
+      </w:r>
+      <w:r>
+        <w:rPr>
+          <w:cs/>
+        </w:rPr>
+        <w:t xml:space="preserve">ដូច្នេះ </w:t>
+      </w:r>
+      <w:r>
+        <w:t xml:space="preserve">Admin </w:t>
+      </w:r>
+      <w:r>
+        <w:rPr>
+          <w:cs/>
+        </w:rPr>
+        <w:t>មិនបាច់បារម្ភរឿងបាត់បង់ទិន្នន័យចុងក្រោយឡើយ។</w:t>
+      </w:r>
+    </w:p>
+    <w:p>
+      <w:pPr>
+        <w:numPr>
+          <w:ilvl w:val="0"/>
+          <w:numId w:val="7"/>
+        </w:numPr>
+      </w:pPr>
+      <w:r>
+        <w:rPr>
+          <w:b/>
+          <w:bCs/>
+          <w:cs/>
+        </w:rPr>
+        <w:t>របៀបដំណើរការ</w:t>
+      </w:r>
+      <w:r>
+        <w:rPr>
+          <w:cs/>
+        </w:rPr>
+        <w:t>៖</w:t>
+      </w:r>
+    </w:p>
+    <w:p>
+      <w:pPr>
+        <w:numPr>
+          <w:ilvl w:val="1"/>
+          <w:numId w:val="7"/>
+        </w:numPr>
+      </w:pPr>
+      <w:r>
+        <w:rPr>
+          <w:b/>
+          <w:bCs/>
+          <w:cs/>
+        </w:rPr>
+        <w:t>ករណីទី ១</w:t>
+      </w:r>
+      <w:r>
+        <w:rPr>
+          <w:cs/>
+        </w:rPr>
+        <w:t xml:space="preserve">៖ ជ្រើសរើស </w:t>
+      </w:r>
+      <w:r>
+        <w:t xml:space="preserve">Snapshot </w:t>
+      </w:r>
+      <w:r>
+        <w:rPr>
+          <w:cs/>
+        </w:rPr>
+        <w:t>ណាមួយដែលមានស្រាប់ក្នុងបញ្ជី រួចចុចប៊ូតុង</w:t>
+      </w:r>
+      <w:r>
+        <w:t> </w:t>
+      </w:r>
+      <w:r>
+        <w:rPr>
+          <w:b/>
+          <w:bCs/>
+        </w:rPr>
+        <w:t>"</w:t>
+      </w:r>
+      <w:r>
+        <w:rPr>
+          <w:b/>
+          <w:bCs/>
+          <w:cs/>
+        </w:rPr>
+        <w:t>ស្តារទិន្នន័យ (</w:t>
+      </w:r>
+      <w:r>
+        <w:rPr>
+          <w:b/>
+          <w:bCs/>
+        </w:rPr>
+        <w:t>Restore)"</w:t>
+      </w:r>
+      <w:r>
+        <w:t> </w:t>
+      </w:r>
+      <w:r>
+        <w:rPr>
+          <w:rFonts w:ascii="Arial Unicode MS" w:eastAsia="Arial Unicode MS" w:hAnsi="Arial Unicode MS" w:cs="Arial Unicode MS" w:hint="eastAsia"/>
+        </w:rPr>
+        <w:t>➔</w:t>
+      </w:r>
+      <w:r>
+        <w:t xml:space="preserve"> </w:t>
+      </w:r>
+      <w:r>
+        <w:rPr>
+          <w:cs/>
+        </w:rPr>
+        <w:t>ប្រព័ន្ធនឹងដំណើរការបញ្ចូលទិន្នន័យចាស់មកវិញភ្លាមៗ។</w:t>
+      </w:r>
+    </w:p>
+    <w:p>
+      <w:pPr>
+        <w:numPr>
+          <w:ilvl w:val="1"/>
+          <w:numId w:val="7"/>
+        </w:numPr>
+      </w:pPr>
+      <w:r>
+        <w:rPr>
+          <w:b/>
+          <w:bCs/>
+          <w:cs/>
+        </w:rPr>
+        <w:lastRenderedPageBreak/>
+        <w:t>ករណីទី ២ (</w:t>
+      </w:r>
+      <w:r>
+        <w:rPr>
+          <w:b/>
+          <w:bCs/>
+        </w:rPr>
+        <w:t>Upload Restore)</w:t>
+      </w:r>
+      <w:r>
+        <w:rPr>
+          <w:cs/>
+        </w:rPr>
+        <w:t>៖</w:t>
+      </w:r>
+      <w:r>
+        <w:t xml:space="preserve"> </w:t>
+      </w:r>
+      <w:r>
+        <w:rPr>
+          <w:cs/>
+        </w:rPr>
+        <w:t xml:space="preserve">ប្រសិនបើ </w:t>
+      </w:r>
+      <w:r>
+        <w:t xml:space="preserve">Server </w:t>
+      </w:r>
+      <w:r>
+        <w:rPr>
+          <w:cs/>
+        </w:rPr>
+        <w:t xml:space="preserve">ត្រូវបានដំឡើងថ្មីទាំងស្រុង </w:t>
+      </w:r>
+      <w:r>
+        <w:t xml:space="preserve">Admin </w:t>
+      </w:r>
+      <w:r>
+        <w:rPr>
+          <w:cs/>
+        </w:rPr>
+        <w:t xml:space="preserve">អាចយក </w:t>
+      </w:r>
+      <w:r>
+        <w:t xml:space="preserve">File Backup </w:t>
+      </w:r>
+      <w:r>
+        <w:rPr>
+          <w:cs/>
+        </w:rPr>
+        <w:t>ពីកុំព្យូទ័រមក</w:t>
+      </w:r>
+      <w:r>
+        <w:t> </w:t>
+      </w:r>
+      <w:r>
+        <w:rPr>
+          <w:b/>
+          <w:bCs/>
+        </w:rPr>
+        <w:t>Upload</w:t>
+      </w:r>
+      <w:r>
+        <w:t> </w:t>
+      </w:r>
+      <w:r>
+        <w:rPr>
+          <w:cs/>
+        </w:rPr>
+        <w:t xml:space="preserve">ចូល នោះប្រព័ន្ធនឹង </w:t>
+      </w:r>
+      <w:r>
+        <w:t xml:space="preserve">Restored </w:t>
+      </w:r>
+      <w:r>
+        <w:rPr>
+          <w:cs/>
+        </w:rPr>
+        <w:t>ដំណើរការដូចដើមវិញ ១០០%។</w:t>
+      </w:r>
+    </w:p>
+    <w:p>
+      <w:r>
+        <w:pict w14:anchorId="5234A8A8">
+          <v:rect id="_x0000_i1075" style="width:403.05pt;height:.75pt" o:hrpct="0" o:hralign="center" o:hrstd="t" o:hr="t" fillcolor="#a0a0a0" stroked="f"/>
+        </w:pict>
+      </w:r>
+    </w:p>
+    <w:p>
+      <w:pPr>
+        <w:rPr>
+          <w:b/>
+          <w:bCs/>
+        </w:rPr>
+      </w:pPr>
+      <w:r>
+        <w:rPr>
+          <w:b/>
+          <w:bCs/>
+          <w:cs/>
+        </w:rPr>
+        <w:t xml:space="preserve">ផ្នែកទី ២៖ ការរៀបចំដើម្បីបង្កើត </w:t>
+      </w:r>
+      <w:r>
+        <w:rPr>
+          <w:b/>
+          <w:bCs/>
+        </w:rPr>
+        <w:t>Telegram Backup Bot</w:t>
+      </w:r>
+    </w:p>
+    <w:p>
+      <w:r>
+        <w:rPr>
+          <w:cs/>
+        </w:rPr>
+        <w:t xml:space="preserve">ដើម្បីបង្កើត </w:t>
+      </w:r>
+      <w:r>
+        <w:t xml:space="preserve">Telegram Bot </w:t>
+      </w:r>
+      <w:r>
+        <w:rPr>
+          <w:cs/>
+        </w:rPr>
+        <w:t xml:space="preserve">សម្រាប់ផ្ញើឯកសារ </w:t>
+      </w:r>
+      <w:r>
+        <w:t xml:space="preserve">Backup </w:t>
+      </w:r>
+      <w:r>
+        <w:rPr>
+          <w:cs/>
+        </w:rPr>
+        <w:t>និងសារជូនដំណឹង លោកអ្នកគ្រាន់តែត្រូវការ</w:t>
+      </w:r>
+      <w:r>
+        <w:t> </w:t>
+      </w:r>
+      <w:r>
+        <w:rPr>
+          <w:b/>
+          <w:bCs/>
+          <w:cs/>
+        </w:rPr>
+        <w:t>២ ចំណុចប៉ុណ្ណោះ</w:t>
+      </w:r>
+      <w:r>
+        <w:rPr>
+          <w:cs/>
+        </w:rPr>
+        <w:t>៖</w:t>
+      </w:r>
+    </w:p>
+    <w:p>
+      <w:pPr>
+        <w:numPr>
+          <w:ilvl w:val="0"/>
+          <w:numId w:val="8"/>
+        </w:numPr>
+      </w:pPr>
+      <w:r>
+        <w:rPr>
+          <w:b/>
+          <w:bCs/>
+        </w:rPr>
+        <w:t>Bot Token</w:t>
+      </w:r>
+      <w:r>
+        <w:t> (</w:t>
+      </w:r>
+      <w:r>
+        <w:rPr>
+          <w:cs/>
+        </w:rPr>
+        <w:t>បានមកពី</w:t>
+      </w:r>
+      <w:r>
+        <w:t> @BotFather)</w:t>
+      </w:r>
+    </w:p>
+    <w:p>
+      <w:pPr>
+        <w:numPr>
+          <w:ilvl w:val="0"/>
+          <w:numId w:val="8"/>
+        </w:numPr>
+      </w:pPr>
+      <w:r>
+        <w:rPr>
+          <w:b/>
+          <w:bCs/>
+        </w:rPr>
+        <w:t>Chat ID</w:t>
+      </w:r>
+      <w:r>
+        <w:t> (</w:t>
+      </w:r>
+      <w:r>
+        <w:rPr>
+          <w:cs/>
+        </w:rPr>
+        <w:t xml:space="preserve">លេខសម្គាល់ </w:t>
+      </w:r>
+      <w:r>
+        <w:t xml:space="preserve">Channel </w:t>
+      </w:r>
+      <w:r>
+        <w:rPr>
+          <w:cs/>
+        </w:rPr>
+        <w:t xml:space="preserve">ឬ </w:t>
+      </w:r>
+      <w:r>
+        <w:t xml:space="preserve">Group </w:t>
+      </w:r>
+      <w:r>
+        <w:rPr>
+          <w:cs/>
+        </w:rPr>
+        <w:t xml:space="preserve">សម្រាប់ទទួល </w:t>
+      </w:r>
+      <w:r>
+        <w:t>File Backup)</w:t>
+      </w:r>
+    </w:p>
+    <w:p>
+      <w:r>
+        <w:pict w14:anchorId="49371337">
+          <v:rect id="_x0000_i1076" style="width:403.05pt;height:.75pt" o:hrpct="0" o:hralign="center" o:hrstd="t" o:hr="t" fillcolor="#a0a0a0" stroked="f"/>
+        </w:pict>
+      </w:r>
+    </w:p>
+    <w:p>
+      <w:r>
+        <w:rPr>
+          <w:cs/>
+        </w:rPr>
+        <w:t xml:space="preserve">ជំហានទី ១៖ បង្កើត </w:t>
+      </w:r>
+      <w:r>
+        <w:t>Telegram Bot (</w:t>
+      </w:r>
+      <w:r>
+        <w:rPr>
+          <w:cs/>
+        </w:rPr>
+        <w:t xml:space="preserve">យក </w:t>
+      </w:r>
+      <w:r>
+        <w:t>Bot Token)</w:t>
+      </w:r>
+    </w:p>
+    <w:p>
+      <w:pPr>
+        <w:numPr>
+          <w:ilvl w:val="0"/>
+          <w:numId w:val="9"/>
+        </w:numPr>
+      </w:pPr>
+      <w:r>
+        <w:rPr>
+          <w:cs/>
+        </w:rPr>
+        <w:t xml:space="preserve">បើកកម្មវិធី </w:t>
+      </w:r>
+      <w:r>
+        <w:t xml:space="preserve">Telegram </w:t>
+      </w:r>
+      <w:r>
+        <w:rPr>
+          <w:cs/>
+        </w:rPr>
+        <w:t>ហើយស្វែងរកគណនីផ្លូវការឈ្មោះ</w:t>
+      </w:r>
+      <w:r>
+        <w:t> </w:t>
+      </w:r>
+      <w:r>
+        <w:rPr>
+          <w:b/>
+          <w:bCs/>
+        </w:rPr>
+        <w:t>@BotFather</w:t>
+      </w:r>
+      <w:r>
+        <w:t> (</w:t>
+      </w:r>
+      <w:r>
+        <w:rPr>
+          <w:cs/>
+        </w:rPr>
+        <w:t>មានសញ្ញាធីកខៀវ)។</w:t>
+      </w:r>
+    </w:p>
+    <w:p>
+      <w:pPr>
+        <w:numPr>
+          <w:ilvl w:val="0"/>
+          <w:numId w:val="9"/>
+        </w:numPr>
+      </w:pPr>
+      <w:r>
+        <w:rPr>
+          <w:cs/>
+        </w:rPr>
+        <w:t>ចុច</w:t>
+      </w:r>
+      <w:r>
+        <w:t> </w:t>
+      </w:r>
+      <w:r>
+        <w:rPr>
+          <w:b/>
+          <w:bCs/>
+        </w:rPr>
+        <w:t>Start</w:t>
+      </w:r>
+      <w:r>
+        <w:t> </w:t>
+      </w:r>
+      <w:r>
+        <w:rPr>
+          <w:cs/>
+        </w:rPr>
+        <w:t>រួចផ្ញើសារពាក្យ៖</w:t>
+      </w:r>
+      <w:r>
+        <w:t> /newbot</w:t>
+      </w:r>
+    </w:p>
+    <w:p>
+      <w:pPr>
+        <w:numPr>
+          <w:ilvl w:val="0"/>
+          <w:numId w:val="9"/>
+        </w:numPr>
+      </w:pPr>
+      <w:r>
+        <w:rPr>
+          <w:cs/>
+        </w:rPr>
+        <w:t>វាយបញ្ចូល</w:t>
+      </w:r>
+      <w:r>
+        <w:t> </w:t>
+      </w:r>
+      <w:r>
+        <w:rPr>
+          <w:b/>
+          <w:bCs/>
+          <w:cs/>
+        </w:rPr>
+        <w:t xml:space="preserve">ឈ្មោះ </w:t>
+      </w:r>
+      <w:r>
+        <w:rPr>
+          <w:b/>
+          <w:bCs/>
+        </w:rPr>
+        <w:t>Bot</w:t>
+      </w:r>
+      <w:r>
+        <w:t> (</w:t>
+      </w:r>
+      <w:r>
+        <w:rPr>
+          <w:cs/>
+        </w:rPr>
+        <w:t>ឧទាហរណ៍៖</w:t>
+      </w:r>
+      <w:r>
+        <w:t> Hun Sen KK High School Bot)</w:t>
+      </w:r>
+      <w:r>
+        <w:rPr>
+          <w:cs/>
+        </w:rPr>
+        <w:t>។</w:t>
+      </w:r>
+    </w:p>
+    <w:p>
+      <w:pPr>
+        <w:numPr>
+          <w:ilvl w:val="0"/>
+          <w:numId w:val="9"/>
+        </w:numPr>
+      </w:pPr>
+      <w:r>
+        <w:rPr>
+          <w:cs/>
+        </w:rPr>
+        <w:t>វាយបញ្ចូល</w:t>
+      </w:r>
+      <w:r>
+        <w:t> </w:t>
+      </w:r>
+      <w:r>
+        <w:rPr>
+          <w:b/>
+          <w:bCs/>
+        </w:rPr>
+        <w:t xml:space="preserve">Username </w:t>
+      </w:r>
+      <w:r>
+        <w:rPr>
+          <w:b/>
+          <w:bCs/>
+          <w:cs/>
+        </w:rPr>
+        <w:t xml:space="preserve">របស់ </w:t>
+      </w:r>
+      <w:r>
+        <w:rPr>
+          <w:b/>
+          <w:bCs/>
+        </w:rPr>
+        <w:t>Bot</w:t>
+      </w:r>
+      <w:r>
+        <w:t> (</w:t>
+      </w:r>
+      <w:r>
+        <w:rPr>
+          <w:cs/>
+        </w:rPr>
+        <w:t>ត្រូវតែបញ្ចប់ដោយពាក្យ</w:t>
+      </w:r>
+      <w:r>
+        <w:t> bot </w:t>
+      </w:r>
+      <w:r>
+        <w:rPr>
+          <w:cs/>
+        </w:rPr>
+        <w:t>ឧទាហរណ៍៖</w:t>
+      </w:r>
+      <w:r>
+        <w:t> hunsen_kk_backup_bot)</w:t>
+      </w:r>
+      <w:r>
+        <w:rPr>
+          <w:cs/>
+        </w:rPr>
+        <w:t>។</w:t>
+      </w:r>
+    </w:p>
+    <w:p>
+      <w:pPr>
+        <w:numPr>
+          <w:ilvl w:val="0"/>
+          <w:numId w:val="9"/>
+        </w:numPr>
+      </w:pPr>
+      <w:r>
+        <w:t>@BotFather </w:t>
+      </w:r>
+      <w:r>
+        <w:rPr>
+          <w:cs/>
+        </w:rPr>
+        <w:t>នឹងផ្ញើ</w:t>
+      </w:r>
+      <w:r>
+        <w:t> </w:t>
+      </w:r>
+      <w:r>
+        <w:rPr>
+          <w:b/>
+          <w:bCs/>
+        </w:rPr>
+        <w:t>HTTP API Token</w:t>
+      </w:r>
+      <w:r>
+        <w:t> </w:t>
+      </w:r>
+      <w:r>
+        <w:rPr>
+          <w:cs/>
+        </w:rPr>
+        <w:t>មកឱ្យអ្នក (ទម្រង់បែបនេះ៖</w:t>
+      </w:r>
+      <w:r>
+        <w:t> 7123456789:AAFn_xxxxxxxxx_xxxxxxxxxxxx)</w:t>
+      </w:r>
+      <w:r>
+        <w:rPr>
+          <w:cs/>
+        </w:rPr>
+        <w:t>។</w:t>
+      </w:r>
+      <w:r>
+        <w:t> </w:t>
+      </w:r>
+      <w:r>
+        <w:rPr>
+          <w:i/>
+          <w:iCs/>
+        </w:rPr>
+        <w:t>(</w:t>
+      </w:r>
+      <w:r>
+        <w:rPr>
+          <w:i/>
+          <w:iCs/>
+          <w:cs/>
+        </w:rPr>
+        <w:t xml:space="preserve">សូមចម្លង </w:t>
+      </w:r>
+      <w:r>
+        <w:rPr>
+          <w:i/>
+          <w:iCs/>
+        </w:rPr>
+        <w:t xml:space="preserve">Token </w:t>
+      </w:r>
+      <w:r>
+        <w:rPr>
+          <w:i/>
+          <w:iCs/>
+          <w:cs/>
+        </w:rPr>
+        <w:t>នេះទុក)</w:t>
+      </w:r>
+    </w:p>
+    <w:p>
+      <w:r>
+        <w:pict w14:anchorId="60E90B2E">
+          <v:rect id="_x0000_i1077" style="width:403.05pt;height:.75pt" o:hrpct="0" o:hralign="center" o:hrstd="t" o:hr="t" fillcolor="#a0a0a0" stroked="f"/>
+        </w:pict>
+      </w:r>
+    </w:p>
+    <w:p>
+      <w:r>
+        <w:rPr>
+          <w:cs/>
+        </w:rPr>
+        <w:t xml:space="preserve">ជំហានទី ២៖ បង្កើត </w:t>
+      </w:r>
+      <w:r>
+        <w:t xml:space="preserve">Channel/Group </w:t>
+      </w:r>
+      <w:r>
+        <w:rPr>
+          <w:cs/>
+        </w:rPr>
+        <w:t xml:space="preserve">និងយក </w:t>
+      </w:r>
+      <w:r>
+        <w:t>Chat ID</w:t>
+      </w:r>
+    </w:p>
+    <w:p>
+      <w:pPr>
+        <w:numPr>
+          <w:ilvl w:val="0"/>
+          <w:numId w:val="10"/>
+        </w:numPr>
+      </w:pPr>
+      <w:r>
+        <w:rPr>
+          <w:cs/>
+        </w:rPr>
+        <w:lastRenderedPageBreak/>
+        <w:t>បង្កើត</w:t>
+      </w:r>
+      <w:r>
+        <w:t> </w:t>
+      </w:r>
+      <w:r>
+        <w:rPr>
+          <w:b/>
+          <w:bCs/>
+        </w:rPr>
+        <w:t>Telegram Channel</w:t>
+      </w:r>
+      <w:r>
+        <w:t> </w:t>
+      </w:r>
+      <w:r>
+        <w:rPr>
+          <w:cs/>
+        </w:rPr>
+        <w:t>ឬ</w:t>
+      </w:r>
+      <w:r>
+        <w:t> </w:t>
+      </w:r>
+      <w:r>
+        <w:rPr>
+          <w:b/>
+          <w:bCs/>
+        </w:rPr>
+        <w:t>Group</w:t>
+      </w:r>
+      <w:r>
+        <w:t> </w:t>
+      </w:r>
+      <w:r>
+        <w:rPr>
+          <w:cs/>
+        </w:rPr>
+        <w:t>ថ្មីមួយ (ឧទាហរណ៍ដាក់ឈ្មោះ៖</w:t>
+      </w:r>
+      <w:r>
+        <w:t> SchoolSM Database Backups)</w:t>
+      </w:r>
+      <w:r>
+        <w:rPr>
+          <w:cs/>
+        </w:rPr>
+        <w:t>។</w:t>
+      </w:r>
+    </w:p>
+    <w:p>
+      <w:pPr>
+        <w:numPr>
+          <w:ilvl w:val="0"/>
+          <w:numId w:val="10"/>
+        </w:numPr>
+      </w:pPr>
+      <w:r>
+        <w:rPr>
+          <w:b/>
+          <w:bCs/>
+        </w:rPr>
+        <w:t xml:space="preserve">Add Bot </w:t>
+      </w:r>
+      <w:r>
+        <w:rPr>
+          <w:b/>
+          <w:bCs/>
+          <w:cs/>
+        </w:rPr>
+        <w:t xml:space="preserve">របស់អ្នកចូលជា </w:t>
+      </w:r>
+      <w:r>
+        <w:rPr>
+          <w:b/>
+          <w:bCs/>
+        </w:rPr>
+        <w:t>Admin</w:t>
+      </w:r>
+      <w:r>
+        <w:t> </w:t>
+      </w:r>
+      <w:r>
+        <w:rPr>
+          <w:cs/>
+        </w:rPr>
+        <w:t xml:space="preserve">ក្នុង </w:t>
+      </w:r>
+      <w:r>
+        <w:t xml:space="preserve">Channel/Group </w:t>
+      </w:r>
+      <w:r>
+        <w:rPr>
+          <w:cs/>
+        </w:rPr>
+        <w:t xml:space="preserve">នោះ (ដើម្បីឱ្យ </w:t>
+      </w:r>
+      <w:r>
+        <w:t xml:space="preserve">Bot </w:t>
+      </w:r>
+      <w:r>
+        <w:rPr>
+          <w:cs/>
+        </w:rPr>
+        <w:t xml:space="preserve">មានសិទ្ធិ </w:t>
+      </w:r>
+      <w:r>
+        <w:t xml:space="preserve">Upload </w:t>
+      </w:r>
+      <w:r>
+        <w:rPr>
+          <w:cs/>
+        </w:rPr>
+        <w:t>ឯកសារ)។</w:t>
+      </w:r>
+    </w:p>
+    <w:p>
+      <w:pPr>
+        <w:numPr>
+          <w:ilvl w:val="0"/>
+          <w:numId w:val="10"/>
+        </w:numPr>
+      </w:pPr>
+      <w:r>
+        <w:rPr>
+          <w:cs/>
+        </w:rPr>
+        <w:t>ដើម្បីយក</w:t>
+      </w:r>
+      <w:r>
+        <w:t> </w:t>
+      </w:r>
+      <w:r>
+        <w:rPr>
+          <w:b/>
+          <w:bCs/>
+        </w:rPr>
+        <w:t>Chat ID</w:t>
+      </w:r>
+      <w:r>
+        <w:t> </w:t>
+      </w:r>
+      <w:r>
+        <w:rPr>
+          <w:cs/>
+        </w:rPr>
+        <w:t xml:space="preserve">នៃ </w:t>
+      </w:r>
+      <w:r>
+        <w:t xml:space="preserve">Channel/Group </w:t>
+      </w:r>
+      <w:r>
+        <w:rPr>
+          <w:cs/>
+        </w:rPr>
+        <w:t>នោះ៖</w:t>
+      </w:r>
+    </w:p>
+    <w:p>
+      <w:pPr>
+        <w:numPr>
+          <w:ilvl w:val="1"/>
+          <w:numId w:val="10"/>
+        </w:numPr>
+      </w:pPr>
+      <w:r>
+        <w:rPr>
+          <w:cs/>
+        </w:rPr>
+        <w:t xml:space="preserve">បន្ថែម </w:t>
+      </w:r>
+      <w:r>
+        <w:t xml:space="preserve">Bot </w:t>
+      </w:r>
+      <w:r>
+        <w:rPr>
+          <w:cs/>
+        </w:rPr>
+        <w:t>ឈ្មោះ</w:t>
+      </w:r>
+      <w:r>
+        <w:t> </w:t>
+      </w:r>
+      <w:r>
+        <w:rPr>
+          <w:b/>
+          <w:bCs/>
+        </w:rPr>
+        <w:t>@userinfobot</w:t>
+      </w:r>
+      <w:r>
+        <w:t> </w:t>
+      </w:r>
+      <w:r>
+        <w:rPr>
+          <w:cs/>
+        </w:rPr>
+        <w:t>ឬ</w:t>
+      </w:r>
+      <w:r>
+        <w:t> </w:t>
+      </w:r>
+      <w:r>
+        <w:rPr>
+          <w:b/>
+          <w:bCs/>
+        </w:rPr>
+        <w:t>@RawDataBot</w:t>
+      </w:r>
+      <w:r>
+        <w:t> </w:t>
+      </w:r>
+      <w:r>
+        <w:rPr>
+          <w:cs/>
+        </w:rPr>
+        <w:t xml:space="preserve">ចូលក្នុង </w:t>
+      </w:r>
+      <w:r>
+        <w:t xml:space="preserve">Channel/Group </w:t>
+      </w:r>
+      <w:r>
+        <w:rPr>
+          <w:cs/>
+        </w:rPr>
+        <w:t xml:space="preserve">នោះ វានឹងបង្ហាញលេខសម្គាល់ </w:t>
+      </w:r>
+      <w:r>
+        <w:t>Chat ID (</w:t>
+      </w:r>
+      <w:r>
+        <w:rPr>
+          <w:cs/>
+        </w:rPr>
+        <w:t>ឧទាហរណ៍៖</w:t>
+      </w:r>
+      <w:r>
+        <w:t> -1002345678901)</w:t>
+      </w:r>
+      <w:r>
+        <w:rPr>
+          <w:cs/>
+        </w:rPr>
+        <w:t>។</w:t>
+      </w:r>
+    </w:p>
+    <w:p>
+      <w:pPr>
+        <w:numPr>
+          <w:ilvl w:val="1"/>
+          <w:numId w:val="10"/>
+        </w:numPr>
+      </w:pPr>
+      <w:r>
+        <w:rPr>
+          <w:cs/>
+        </w:rPr>
+        <w:t xml:space="preserve">ឬផ្ញើសារ ១ ចូលទៅក្នុង </w:t>
+      </w:r>
+      <w:r>
+        <w:t xml:space="preserve">Channel/Group </w:t>
+      </w:r>
+      <w:r>
+        <w:rPr>
+          <w:cs/>
+        </w:rPr>
+        <w:t xml:space="preserve">នោះ រួចបើក </w:t>
+      </w:r>
+      <w:r>
+        <w:t xml:space="preserve">Link </w:t>
+      </w:r>
+      <w:r>
+        <w:rPr>
+          <w:cs/>
+        </w:rPr>
+        <w:t xml:space="preserve">លើ </w:t>
+      </w:r>
+      <w:r>
+        <w:t>Browser</w:t>
+      </w:r>
+      <w:r>
+        <w:rPr>
+          <w:cs/>
+        </w:rPr>
+        <w:t>៖</w:t>
+      </w:r>
+      <w:r>
+        <w:br/>
+        <w:t>https://api.telegram.org/bot&lt;YOUR_BOT_TOKEN&gt;/getUpdates </w:t>
+      </w:r>
+      <w:r>
+        <w:rPr>
+          <w:cs/>
+        </w:rPr>
+        <w:t>វានឹងបង្ហាញលេខ</w:t>
+      </w:r>
+      <w:r>
+        <w:t> "chat":{"id": -100xxxxxxxxxx}</w:t>
+      </w:r>
+      <w:r>
+        <w:rPr>
+          <w:cs/>
+        </w:rPr>
+        <w:t>។</w:t>
+      </w:r>
+    </w:p>
+    <w:p>
+      <w:r>
+        <w:pict w14:anchorId="675EDA9F">
+          <v:rect id="_x0000_i1078" style="width:403.05pt;height:.75pt" o:hrpct="0" o:hralign="center" o:hrstd="t" o:hr="t" fillcolor="#a0a0a0" stroked="f"/>
+        </w:pict>
+      </w:r>
+    </w:p>
+    <w:p>
+      <w:r>
+        <w:rPr>
+          <w:cs/>
+        </w:rPr>
+        <w:t xml:space="preserve">ជំហានទី ៣៖ ភ្ជាប់ចូលប្រព័ន្ធ </w:t>
+      </w:r>
+      <w:r>
+        <w:t>SchoolSM</w:t>
+      </w:r>
+    </w:p>
+    <w:p>
+      <w:pPr>
+        <w:numPr>
+          <w:ilvl w:val="0"/>
+          <w:numId w:val="11"/>
+        </w:numPr>
+      </w:pPr>
+      <w:r>
+        <w:rPr>
+          <w:cs/>
+        </w:rPr>
+        <w:t xml:space="preserve">ចូលទៅកាន់ប្រព័ន្ធ </w:t>
+      </w:r>
+      <w:r>
+        <w:t xml:space="preserve">SchoolSM </w:t>
+      </w:r>
+      <w:r>
+        <w:rPr>
+          <w:cs/>
+        </w:rPr>
+        <w:t xml:space="preserve">តាមគណនី </w:t>
+      </w:r>
+      <w:r>
+        <w:t>Admin</w:t>
+      </w:r>
+      <w:r>
+        <w:rPr>
+          <w:cs/>
+        </w:rPr>
+        <w:t>។</w:t>
+      </w:r>
+    </w:p>
+    <w:p>
+      <w:pPr>
+        <w:numPr>
+          <w:ilvl w:val="0"/>
+          <w:numId w:val="11"/>
+        </w:numPr>
+      </w:pPr>
+      <w:r>
+        <w:rPr>
+          <w:cs/>
+        </w:rPr>
+        <w:t>ចូលទៅកាន់</w:t>
+      </w:r>
+      <w:r>
+        <w:t> </w:t>
+      </w:r>
+      <w:r>
+        <w:rPr>
+          <w:b/>
+          <w:bCs/>
+          <w:cs/>
+        </w:rPr>
+        <w:t xml:space="preserve">ការកំណត់ប្រព័ន្ធ </w:t>
+      </w:r>
+      <w:r>
+        <w:rPr>
+          <w:rFonts w:ascii="Arial Unicode MS" w:eastAsia="Arial Unicode MS" w:hAnsi="Arial Unicode MS" w:cs="Arial Unicode MS" w:hint="eastAsia"/>
+          <w:b/>
+          <w:bCs/>
+          <w:cs/>
+        </w:rPr>
+        <w:t>➔</w:t>
+      </w:r>
+      <w:r>
+        <w:rPr>
+          <w:b/>
+          <w:bCs/>
+          <w:cs/>
+        </w:rPr>
+        <w:t xml:space="preserve"> </w:t>
+      </w:r>
+      <w:r>
+        <w:rPr>
+          <w:b/>
+          <w:bCs/>
+        </w:rPr>
+        <w:t>Telegram Notifications</w:t>
+      </w:r>
+      <w:r>
+        <w:t xml:space="preserve"> (/accounts/telegram/) </w:t>
+      </w:r>
+      <w:r>
+        <w:rPr>
+          <w:cs/>
+        </w:rPr>
+        <w:t>ឬ</w:t>
+      </w:r>
+      <w:r>
+        <w:t> </w:t>
+      </w:r>
+      <w:r>
+        <w:rPr>
+          <w:b/>
+          <w:bCs/>
+        </w:rPr>
+        <w:t xml:space="preserve">Database Backup </w:t>
+      </w:r>
+      <w:r>
+        <w:rPr>
+          <w:rFonts w:ascii="Arial Unicode MS" w:eastAsia="Arial Unicode MS" w:hAnsi="Arial Unicode MS" w:cs="Arial Unicode MS" w:hint="eastAsia"/>
+          <w:b/>
+          <w:bCs/>
+        </w:rPr>
+        <w:t>➔</w:t>
+      </w:r>
+      <w:r>
+        <w:rPr>
+          <w:b/>
+          <w:bCs/>
+        </w:rPr>
+        <w:t xml:space="preserve"> </w:t>
+      </w:r>
+      <w:r>
+        <w:rPr>
+          <w:b/>
+          <w:bCs/>
+          <w:cs/>
+        </w:rPr>
+        <w:t>កំណត់កាលវិភាគ</w:t>
+      </w:r>
+      <w:r>
+        <w:t> (/tools/database-backup/)</w:t>
+      </w:r>
+      <w:r>
+        <w:rPr>
+          <w:cs/>
+        </w:rPr>
+        <w:t>។</w:t>
+      </w:r>
+    </w:p>
+    <w:p>
+      <w:pPr>
+        <w:numPr>
+          <w:ilvl w:val="0"/>
+          <w:numId w:val="11"/>
+        </w:numPr>
+      </w:pPr>
+      <w:r>
+        <w:rPr>
+          <w:cs/>
+        </w:rPr>
+        <w:t>បំពេញ៖</w:t>
+      </w:r>
+    </w:p>
+    <w:p>
+      <w:pPr>
+        <w:numPr>
+          <w:ilvl w:val="1"/>
+          <w:numId w:val="11"/>
+        </w:numPr>
+      </w:pPr>
+      <w:r>
+        <w:rPr>
+          <w:b/>
+          <w:bCs/>
+        </w:rPr>
+        <w:t>Bot Token</w:t>
+      </w:r>
+      <w:r>
+        <w:t> </w:t>
+      </w:r>
+      <w:r>
+        <w:rPr>
+          <w:rFonts w:ascii="Arial Unicode MS" w:eastAsia="Arial Unicode MS" w:hAnsi="Arial Unicode MS" w:cs="Arial Unicode MS" w:hint="eastAsia"/>
+        </w:rPr>
+        <w:t>➔</w:t>
+      </w:r>
+      <w:r>
+        <w:t xml:space="preserve"> </w:t>
+      </w:r>
+      <w:r>
+        <w:rPr>
+          <w:cs/>
+        </w:rPr>
+        <w:t xml:space="preserve">បិទភ្ជាប់ </w:t>
+      </w:r>
+      <w:r>
+        <w:t xml:space="preserve">Token </w:t>
+      </w:r>
+      <w:r>
+        <w:rPr>
+          <w:cs/>
+        </w:rPr>
+        <w:t xml:space="preserve">ដែលបានពី </w:t>
+      </w:r>
+      <w:r>
+        <w:t>BotFather</w:t>
+      </w:r>
+    </w:p>
+    <w:p>
+      <w:pPr>
+        <w:numPr>
+          <w:ilvl w:val="1"/>
+          <w:numId w:val="11"/>
+        </w:numPr>
+      </w:pPr>
+      <w:r>
+        <w:rPr>
+          <w:b/>
+          <w:bCs/>
+        </w:rPr>
+        <w:t>Chat ID / Backup Channel ID</w:t>
+      </w:r>
+      <w:r>
+        <w:t> </w:t>
+      </w:r>
+      <w:r>
+        <w:rPr>
+          <w:rFonts w:ascii="Arial Unicode MS" w:eastAsia="Arial Unicode MS" w:hAnsi="Arial Unicode MS" w:cs="Arial Unicode MS" w:hint="eastAsia"/>
+        </w:rPr>
+        <w:t>➔</w:t>
+      </w:r>
+      <w:r>
+        <w:t xml:space="preserve"> </w:t>
+      </w:r>
+      <w:r>
+        <w:rPr>
+          <w:cs/>
+        </w:rPr>
+        <w:t xml:space="preserve">បិទភ្ជាប់លេខ </w:t>
+      </w:r>
+      <w:r>
+        <w:t>Chat ID (</w:t>
+      </w:r>
+      <w:r>
+        <w:rPr>
+          <w:cs/>
+        </w:rPr>
+        <w:t>ឧទាហរណ៍៖</w:t>
+      </w:r>
+      <w:r>
+        <w:t> -1002345678901)</w:t>
+      </w:r>
+    </w:p>
+    <w:p>
+      <w:pPr>
+        <w:numPr>
+          <w:ilvl w:val="1"/>
+          <w:numId w:val="11"/>
+        </w:numPr>
+      </w:pPr>
+      <w:r>
+        <w:rPr>
+          <w:b/>
+          <w:bCs/>
+          <w:cs/>
+        </w:rPr>
+        <w:t xml:space="preserve">បើក </w:t>
+      </w:r>
+      <w:r>
+        <w:rPr>
+          <w:b/>
+          <w:bCs/>
+        </w:rPr>
+        <w:t>Auto-Backup</w:t>
+      </w:r>
+      <w:r>
+        <w:t> </w:t>
+      </w:r>
+      <w:r>
+        <w:rPr>
+          <w:rFonts w:ascii="Arial Unicode MS" w:eastAsia="Arial Unicode MS" w:hAnsi="Arial Unicode MS" w:cs="Arial Unicode MS" w:hint="eastAsia"/>
+        </w:rPr>
+        <w:t>➔</w:t>
+      </w:r>
+      <w:r>
+        <w:t xml:space="preserve"> </w:t>
+      </w:r>
+      <w:r>
+        <w:rPr>
+          <w:cs/>
+        </w:rPr>
+        <w:t>ជ្រើសរើស</w:t>
+      </w:r>
+      <w:r>
+        <w:t> </w:t>
+      </w:r>
+      <w:r>
+        <w:rPr>
+          <w:b/>
+          <w:bCs/>
+          <w:cs/>
+        </w:rPr>
+        <w:t>រៀងរាល់ថ្ងៃ (</w:t>
+      </w:r>
+      <w:r>
+        <w:rPr>
+          <w:b/>
+          <w:bCs/>
+        </w:rPr>
+        <w:t>Daily)</w:t>
+      </w:r>
+      <w:r>
+        <w:t> </w:t>
+      </w:r>
+      <w:r>
+        <w:rPr>
+          <w:cs/>
+        </w:rPr>
+        <w:t>ម៉ោង</w:t>
+      </w:r>
+      <w:r>
+        <w:t> </w:t>
+      </w:r>
+      <w:r>
+        <w:rPr>
+          <w:b/>
+          <w:bCs/>
+        </w:rPr>
+        <w:t>02:00</w:t>
+      </w:r>
+      <w:r>
+        <w:t> (</w:t>
+      </w:r>
+      <w:r>
+        <w:rPr>
+          <w:cs/>
+        </w:rPr>
+        <w:t>យប់)។</w:t>
+      </w:r>
+    </w:p>
+    <w:p>
+      <w:pPr>
+        <w:numPr>
+          <w:ilvl w:val="0"/>
+          <w:numId w:val="11"/>
+        </w:numPr>
+      </w:pPr>
+      <w:r>
+        <w:rPr>
+          <w:cs/>
+        </w:rPr>
+        <w:t>ចុច</w:t>
+      </w:r>
+      <w:r>
+        <w:t> </w:t>
+      </w:r>
+      <w:r>
+        <w:rPr>
+          <w:b/>
+          <w:bCs/>
+        </w:rPr>
+        <w:t>"</w:t>
+      </w:r>
+      <w:r>
+        <w:rPr>
+          <w:b/>
+          <w:bCs/>
+          <w:cs/>
+        </w:rPr>
+        <w:t>រក្សាទុកការកំណត់"</w:t>
+      </w:r>
+      <w:r>
+        <w:t> </w:t>
+      </w:r>
+      <w:r>
+        <w:rPr>
+          <w:cs/>
+        </w:rPr>
+        <w:t>រួចចុចប៊ូតុង</w:t>
+      </w:r>
+      <w:r>
+        <w:t> </w:t>
+      </w:r>
+      <w:r>
+        <w:rPr>
+          <w:b/>
+          <w:bCs/>
+        </w:rPr>
+        <w:t>"</w:t>
+      </w:r>
+      <w:r>
+        <w:rPr>
+          <w:b/>
+          <w:bCs/>
+          <w:cs/>
+        </w:rPr>
+        <w:t xml:space="preserve">ផ្ញើ </w:t>
+      </w:r>
+      <w:r>
+        <w:rPr>
+          <w:b/>
+          <w:bCs/>
+        </w:rPr>
+        <w:t xml:space="preserve">Test </w:t>
+      </w:r>
+      <w:r>
+        <w:rPr>
+          <w:b/>
+          <w:bCs/>
+          <w:cs/>
+        </w:rPr>
+        <w:t xml:space="preserve">ទៅ </w:t>
+      </w:r>
+      <w:r>
+        <w:rPr>
+          <w:b/>
+          <w:bCs/>
+        </w:rPr>
+        <w:t>Telegram"</w:t>
+      </w:r>
+      <w:r>
+        <w:t> </w:t>
+      </w:r>
+      <w:r>
+        <w:rPr>
+          <w:rFonts w:ascii="Arial Unicode MS" w:eastAsia="Arial Unicode MS" w:hAnsi="Arial Unicode MS" w:cs="Arial Unicode MS" w:hint="eastAsia"/>
+        </w:rPr>
+        <w:t>➔</w:t>
+      </w:r>
+      <w:r>
+        <w:t xml:space="preserve"> </w:t>
+      </w:r>
+      <w:r>
+        <w:rPr>
+          <w:cs/>
+        </w:rPr>
+        <w:t xml:space="preserve">ប្រព័ន្ធនឹង </w:t>
+      </w:r>
+      <w:r>
+        <w:t xml:space="preserve">Dump Database </w:t>
+      </w:r>
+      <w:r>
+        <w:rPr>
+          <w:cs/>
+        </w:rPr>
+        <w:t xml:space="preserve">ភ្លាមៗ ហើយ </w:t>
+      </w:r>
+      <w:r>
+        <w:t xml:space="preserve">Bot </w:t>
+      </w:r>
+      <w:r>
+        <w:rPr>
+          <w:cs/>
+        </w:rPr>
+        <w:t xml:space="preserve">នឹង </w:t>
+      </w:r>
+      <w:r>
+        <w:t xml:space="preserve">Upload File </w:t>
+      </w:r>
+      <w:r>
+        <w:rPr>
+          <w:cs/>
+        </w:rPr>
+        <w:t xml:space="preserve">ចូលទៅក្នុង </w:t>
+      </w:r>
+      <w:r>
+        <w:t xml:space="preserve">Telegram Channel </w:t>
+      </w:r>
+      <w:r>
+        <w:rPr>
+          <w:cs/>
+        </w:rPr>
+        <w:t>របស់អ្នកភ្លាមៗ!</w:t>
+      </w:r>
+    </w:p>
     <w:p/>
     <w:sectPr>
       <w:pgSz w:w="12240" w:h="15840"/>
@@ -1178,6 +3930,123 @@
 <file path=word/numbering.xml><?xml version="1.0" encoding="utf-8"?>
 <w:numbering xmlns:wpc="http://schemas.microsoft.com/office/word/2010/wordprocessingCanvas" xmlns:cx="http://schemas.microsoft.com/office/drawing/2014/chartex" xmlns:cx1="http://schemas.microsoft.com/office/drawing/2015/9/8/chartex" xmlns:cx2="http://schemas.microsoft.com/office/drawing/2015/10/21/chartex" xmlns:cx3="http://schemas.microsoft.com/office/drawing/2016/5/9/chartex" xmlns:cx4="http://schemas.microsoft.com/office/drawing/2016/5/10/chartex" xmlns:cx5="http://schemas.microsoft.com/office/drawing/2016/5/11/chartex" xmlns:cx6="http://schemas.microsoft.com/office/drawing/2016/5/12/chartex" xmlns:cx7="http://schemas.microsoft.com/office/drawing/2016/5/13/chartex" xmlns:cx8="http://schemas.microsoft.com/office/drawing/2016/5/14/chartex" xmlns:mc="http://schemas.openxmlformats.org/markup-compatibility/2006" xmlns:aink="http://schemas.microsoft.com/office/drawing/2016/ink" xmlns:am3d="http://schemas.microsoft.com/office/drawing/2017/model3d" xmlns:o="urn:schemas-microsoft-com:office:office" xmlns:oel="http://schemas.microsoft.com/office/2019/extlst" xmlns:r="http://schemas.openxmlformats.org/officeDocument/2006/relationships" xmlns:m="http://schemas.openxmlformats.org/officeDocument/2006/math" xmlns:v="urn:schemas-microsoft-com:vml" xmlns:wp14="http://schemas.microsoft.com/office/word/2010/wordprocessingDrawing" xmlns:wp="http://schemas.openxmlformats.org/drawingml/2006/wordprocessingDrawing" xmlns:w10="urn:schemas-microsoft-com:office:word" xmlns:w="http://schemas.openxmlformats.org/wordprocessingml/2006/main" xmlns:w14="http://schemas.microsoft.com/office/word/2010/wordml" xmlns:w15="http://schemas.microsoft.com/office/word/2012/wordml" xmlns:w16cex="http://schemas.microsoft.com/office/word/2018/wordml/cex" xmlns:w16cid="http://schemas.microsoft.com/office/word/2016/wordml/cid" xmlns:w16="http://schemas.microsoft.com/office/word/2018/wordml" xmlns:w16du="http://schemas.microsoft.com/office/word/2023/wordml/word16du" xmlns:w16sdtdh="http://schemas.microsoft.com/office/word/2020/wordml/sdtdatahash" xmlns:w16sdtfl="http://schemas.microsoft.com/office/word/2024/wordml/sdtformatlock" xmlns:w16se="http://schemas.microsoft.com/office/word/2015/wordml/symex" xmlns:wpg="http://schemas.microsoft.com/office/word/2010/wordprocessingGroup" xmlns:wpi="http://schemas.microsoft.com/office/word/2010/wordprocessingInk" xmlns:wne="http://schemas.microsoft.com/office/word/2006/wordml" xmlns:wps="http://schemas.microsoft.com/office/word/2010/wordprocessingShape" mc:Ignorable="w14 w15 w16se w16cid w16 w16cex w16sdtdh w16sdtfl w16du wp14">
   <w:abstractNum w:abstractNumId="0" w15:restartNumberingAfterBreak="0">
+    <w:nsid w:val="057047DA"/>
+    <w:multiLevelType w:val="multilevel"/>
+    <w:tmpl w:val="50A40250"/>
+    <w:lvl w:ilvl="0">
+      <w:start w:val="1"/>
+      <w:numFmt w:val="decimal"/>
+      <w:lvlText w:val="%1."/>
+      <w:lvlJc w:val="left"/>
+      <w:pPr>
+        <w:tabs>
+          <w:tab w:val="num" w:pos="720"/>
+        </w:tabs>
+        <w:ind w:left="720" w:hanging="360"/>
+      </w:pPr>
+    </w:lvl>
+    <w:lvl w:ilvl="1">
+      <w:start w:val="1"/>
+      <w:numFmt w:val="bullet"/>
+      <w:lvlText w:val=""/>
+      <w:lvlJc w:val="left"/>
+      <w:pPr>
+        <w:tabs>
+          <w:tab w:val="num" w:pos="1440"/>
+        </w:tabs>
+        <w:ind w:left="1440" w:hanging="360"/>
+      </w:pPr>
+      <w:rPr>
+        <w:rFonts w:ascii="Symbol" w:hAnsi="Symbol" w:hint="default"/>
+        <w:sz w:val="20"/>
+      </w:rPr>
+    </w:lvl>
+    <w:lvl w:ilvl="2" w:tentative="1">
+      <w:start w:val="1"/>
+      <w:numFmt w:val="decimal"/>
+      <w:lvlText w:val="%3."/>
+      <w:lvlJc w:val="left"/>
+      <w:pPr>
+        <w:tabs>
+          <w:tab w:val="num" w:pos="2160"/>
+        </w:tabs>
+        <w:ind w:left="2160" w:hanging="360"/>
+      </w:pPr>
+    </w:lvl>
+    <w:lvl w:ilvl="3" w:tentative="1">
+      <w:start w:val="1"/>
+      <w:numFmt w:val="decimal"/>
+      <w:lvlText w:val="%4."/>
+      <w:lvlJc w:val="left"/>
+      <w:pPr>
+        <w:tabs>
+          <w:tab w:val="num" w:pos="2880"/>
+        </w:tabs>
+        <w:ind w:left="2880" w:hanging="360"/>
+      </w:pPr>
+    </w:lvl>
+    <w:lvl w:ilvl="4" w:tentative="1">
+      <w:start w:val="1"/>
+      <w:numFmt w:val="decimal"/>
+      <w:lvlText w:val="%5."/>
+      <w:lvlJc w:val="left"/>
+      <w:pPr>
+        <w:tabs>
+          <w:tab w:val="num" w:pos="3600"/>
+        </w:tabs>
+        <w:ind w:left="3600" w:hanging="360"/>
+      </w:pPr>
+    </w:lvl>
+    <w:lvl w:ilvl="5" w:tentative="1">
+      <w:start w:val="1"/>
+      <w:numFmt w:val="decimal"/>
+      <w:lvlText w:val="%6."/>
+      <w:lvlJc w:val="left"/>
+      <w:pPr>
+        <w:tabs>
+          <w:tab w:val="num" w:pos="4320"/>
+        </w:tabs>
+        <w:ind w:left="4320" w:hanging="360"/>
+      </w:pPr>
+    </w:lvl>
+    <w:lvl w:ilvl="6" w:tentative="1">
+      <w:start w:val="1"/>
+      <w:numFmt w:val="decimal"/>
+      <w:lvlText w:val="%7."/>
+      <w:lvlJc w:val="left"/>
+      <w:pPr>
+        <w:tabs>
+          <w:tab w:val="num" w:pos="5040"/>
+        </w:tabs>
+        <w:ind w:left="5040" w:hanging="360"/>
+      </w:pPr>
+    </w:lvl>
+    <w:lvl w:ilvl="7" w:tentative="1">
+      <w:start w:val="1"/>
+      <w:numFmt w:val="decimal"/>
+      <w:lvlText w:val="%8."/>
+      <w:lvlJc w:val="left"/>
+      <w:pPr>
+        <w:tabs>
+          <w:tab w:val="num" w:pos="5760"/>
+        </w:tabs>
+        <w:ind w:left="5760" w:hanging="360"/>
+      </w:pPr>
+    </w:lvl>
+    <w:lvl w:ilvl="8" w:tentative="1">
+      <w:start w:val="1"/>
+      <w:numFmt w:val="decimal"/>
+      <w:lvlText w:val="%9."/>
+      <w:lvlJc w:val="left"/>
+      <w:pPr>
+        <w:tabs>
+          <w:tab w:val="num" w:pos="6480"/>
+        </w:tabs>
+        <w:ind w:left="6480" w:hanging="360"/>
+      </w:pPr>
+    </w:lvl>
+  </w:abstractNum>
+  <w:abstractNum w:abstractNumId="1" w15:restartNumberingAfterBreak="0">
     <w:nsid w:val="0A2020FA"/>
     <w:multiLevelType w:val="multilevel"/>
     <w:tmpl w:val="8F02B6DA"/>
@@ -1326,7 +4195,120 @@
       </w:rPr>
     </w:lvl>
   </w:abstractNum>
-  <w:abstractNum w:abstractNumId="1" w15:restartNumberingAfterBreak="0">
+  <w:abstractNum w:abstractNumId="2" w15:restartNumberingAfterBreak="0">
+    <w:nsid w:val="107F1474"/>
+    <w:multiLevelType w:val="multilevel"/>
+    <w:tmpl w:val="9E721D54"/>
+    <w:lvl w:ilvl="0">
+      <w:start w:val="1"/>
+      <w:numFmt w:val="decimal"/>
+      <w:lvlText w:val="%1."/>
+      <w:lvlJc w:val="left"/>
+      <w:pPr>
+        <w:tabs>
+          <w:tab w:val="num" w:pos="720"/>
+        </w:tabs>
+        <w:ind w:left="720" w:hanging="360"/>
+      </w:pPr>
+    </w:lvl>
+    <w:lvl w:ilvl="1" w:tentative="1">
+      <w:start w:val="1"/>
+      <w:numFmt w:val="decimal"/>
+      <w:lvlText w:val="%2."/>
+      <w:lvlJc w:val="left"/>
+      <w:pPr>
+        <w:tabs>
+          <w:tab w:val="num" w:pos="1440"/>
+        </w:tabs>
+        <w:ind w:left="1440" w:hanging="360"/>
+      </w:pPr>
+    </w:lvl>
+    <w:lvl w:ilvl="2" w:tentative="1">
+      <w:start w:val="1"/>
+      <w:numFmt w:val="decimal"/>
+      <w:lvlText w:val="%3."/>
+      <w:lvlJc w:val="left"/>
+      <w:pPr>
+        <w:tabs>
+          <w:tab w:val="num" w:pos="2160"/>
+        </w:tabs>
+        <w:ind w:left="2160" w:hanging="360"/>
+      </w:pPr>
+    </w:lvl>
+    <w:lvl w:ilvl="3" w:tentative="1">
+      <w:start w:val="1"/>
+      <w:numFmt w:val="decimal"/>
+      <w:lvlText w:val="%4."/>
+      <w:lvlJc w:val="left"/>
+      <w:pPr>
+        <w:tabs>
+          <w:tab w:val="num" w:pos="2880"/>
+        </w:tabs>
+        <w:ind w:left="2880" w:hanging="360"/>
+      </w:pPr>
+    </w:lvl>
+    <w:lvl w:ilvl="4" w:tentative="1">
+      <w:start w:val="1"/>
+      <w:numFmt w:val="decimal"/>
+      <w:lvlText w:val="%5."/>
+      <w:lvlJc w:val="left"/>
+      <w:pPr>
+        <w:tabs>
+          <w:tab w:val="num" w:pos="3600"/>
+        </w:tabs>
+        <w:ind w:left="3600" w:hanging="360"/>
+      </w:pPr>
+    </w:lvl>
+    <w:lvl w:ilvl="5" w:tentative="1">
+      <w:start w:val="1"/>
+      <w:numFmt w:val="decimal"/>
+      <w:lvlText w:val="%6."/>
+      <w:lvlJc w:val="left"/>
+      <w:pPr>
+        <w:tabs>
+          <w:tab w:val="num" w:pos="4320"/>
+        </w:tabs>
+        <w:ind w:left="4320" w:hanging="360"/>
+      </w:pPr>
+    </w:lvl>
+    <w:lvl w:ilvl="6" w:tentative="1">
+      <w:start w:val="1"/>
+      <w:numFmt w:val="decimal"/>
+      <w:lvlText w:val="%7."/>
+      <w:lvlJc w:val="left"/>
+      <w:pPr>
+        <w:tabs>
+          <w:tab w:val="num" w:pos="5040"/>
+        </w:tabs>
+        <w:ind w:left="5040" w:hanging="360"/>
+      </w:pPr>
+    </w:lvl>
+    <w:lvl w:ilvl="7" w:tentative="1">
+      <w:start w:val="1"/>
+      <w:numFmt w:val="decimal"/>
+      <w:lvlText w:val="%8."/>
+      <w:lvlJc w:val="left"/>
+      <w:pPr>
+        <w:tabs>
+          <w:tab w:val="num" w:pos="5760"/>
+        </w:tabs>
+        <w:ind w:left="5760" w:hanging="360"/>
+      </w:pPr>
+    </w:lvl>
+    <w:lvl w:ilvl="8" w:tentative="1">
+      <w:start w:val="1"/>
+      <w:numFmt w:val="decimal"/>
+      <w:lvlText w:val="%9."/>
+      <w:lvlJc w:val="left"/>
+      <w:pPr>
+        <w:tabs>
+          <w:tab w:val="num" w:pos="6480"/>
+        </w:tabs>
+        <w:ind w:left="6480" w:hanging="360"/>
+      </w:pPr>
+    </w:lvl>
+  </w:abstractNum>
+  <w:abstractNum w:abstractNumId="3" w15:restartNumberingAfterBreak="0">
     <w:nsid w:val="16AE35A9"/>
     <w:multiLevelType w:val="multilevel"/>
     <w:tmpl w:val="92CAB1A4"/>
@@ -1475,7 +4457,7 @@
       </w:rPr>
     </w:lvl>
   </w:abstractNum>
-  <w:abstractNum w:abstractNumId="2" w15:restartNumberingAfterBreak="0">
+  <w:abstractNum w:abstractNumId="4" w15:restartNumberingAfterBreak="0">
     <w:nsid w:val="23860A46"/>
     <w:multiLevelType w:val="multilevel"/>
     <w:tmpl w:val="A1A0DF38"/>
@@ -1624,7 +4606,7 @@
       </w:rPr>
     </w:lvl>
   </w:abstractNum>
-  <w:abstractNum w:abstractNumId="3" w15:restartNumberingAfterBreak="0">
+  <w:abstractNum w:abstractNumId="5" w15:restartNumberingAfterBreak="0">
     <w:nsid w:val="33631A50"/>
     <w:multiLevelType w:val="multilevel"/>
     <w:tmpl w:val="243A1904"/>
@@ -1773,17 +4755,707 @@
       </w:rPr>
     </w:lvl>
   </w:abstractNum>
+  <w:abstractNum w:abstractNumId="6" w15:restartNumberingAfterBreak="0">
+    <w:nsid w:val="3AD54527"/>
+    <w:multiLevelType w:val="multilevel"/>
+    <w:tmpl w:val="4D5C29C6"/>
+    <w:lvl w:ilvl="0">
+      <w:start w:val="1"/>
+      <w:numFmt w:val="bullet"/>
+      <w:lvlText w:val=""/>
+      <w:lvlJc w:val="left"/>
+      <w:pPr>
+        <w:tabs>
+          <w:tab w:val="num" w:pos="720"/>
+        </w:tabs>
+        <w:ind w:left="720" w:hanging="360"/>
+      </w:pPr>
+      <w:rPr>
+        <w:rFonts w:ascii="Symbol" w:hAnsi="Symbol" w:hint="default"/>
+        <w:sz w:val="20"/>
+      </w:rPr>
+    </w:lvl>
+    <w:lvl w:ilvl="1">
+      <w:start w:val="1"/>
+      <w:numFmt w:val="decimal"/>
+      <w:lvlText w:val="%2."/>
+      <w:lvlJc w:val="left"/>
+      <w:pPr>
+        <w:tabs>
+          <w:tab w:val="num" w:pos="1440"/>
+        </w:tabs>
+        <w:ind w:left="1440" w:hanging="360"/>
+      </w:pPr>
+    </w:lvl>
+    <w:lvl w:ilvl="2" w:tentative="1">
+      <w:start w:val="1"/>
+      <w:numFmt w:val="bullet"/>
+      <w:lvlText w:val=""/>
+      <w:lvlJc w:val="left"/>
+      <w:pPr>
+        <w:tabs>
+          <w:tab w:val="num" w:pos="2160"/>
+        </w:tabs>
+        <w:ind w:left="2160" w:hanging="360"/>
+      </w:pPr>
+      <w:rPr>
+        <w:rFonts w:ascii="Symbol" w:hAnsi="Symbol" w:hint="default"/>
+        <w:sz w:val="20"/>
+      </w:rPr>
+    </w:lvl>
+    <w:lvl w:ilvl="3" w:tentative="1">
+      <w:start w:val="1"/>
+      <w:numFmt w:val="bullet"/>
+      <w:lvlText w:val=""/>
+      <w:lvlJc w:val="left"/>
+      <w:pPr>
+        <w:tabs>
+          <w:tab w:val="num" w:pos="2880"/>
+        </w:tabs>
+        <w:ind w:left="2880" w:hanging="360"/>
+      </w:pPr>
+      <w:rPr>
+        <w:rFonts w:ascii="Symbol" w:hAnsi="Symbol" w:hint="default"/>
+        <w:sz w:val="20"/>
+      </w:rPr>
+    </w:lvl>
+    <w:lvl w:ilvl="4" w:tentative="1">
+      <w:start w:val="1"/>
+      <w:numFmt w:val="bullet"/>
+      <w:lvlText w:val=""/>
+      <w:lvlJc w:val="left"/>
+      <w:pPr>
+        <w:tabs>
+          <w:tab w:val="num" w:pos="3600"/>
+        </w:tabs>
+        <w:ind w:left="3600" w:hanging="360"/>
+      </w:pPr>
+      <w:rPr>
+        <w:rFonts w:ascii="Symbol" w:hAnsi="Symbol" w:hint="default"/>
+        <w:sz w:val="20"/>
+      </w:rPr>
+    </w:lvl>
+    <w:lvl w:ilvl="5" w:tentative="1">
+      <w:start w:val="1"/>
+      <w:numFmt w:val="bullet"/>
+      <w:lvlText w:val=""/>
+      <w:lvlJc w:val="left"/>
+      <w:pPr>
+        <w:tabs>
+          <w:tab w:val="num" w:pos="4320"/>
+        </w:tabs>
+        <w:ind w:left="4320" w:hanging="360"/>
+      </w:pPr>
+      <w:rPr>
+        <w:rFonts w:ascii="Symbol" w:hAnsi="Symbol" w:hint="default"/>
+        <w:sz w:val="20"/>
+      </w:rPr>
+    </w:lvl>
+    <w:lvl w:ilvl="6" w:tentative="1">
+      <w:start w:val="1"/>
+      <w:numFmt w:val="bullet"/>
+      <w:lvlText w:val=""/>
+      <w:lvlJc w:val="left"/>
+      <w:pPr>
+        <w:tabs>
+          <w:tab w:val="num" w:pos="5040"/>
+        </w:tabs>
+        <w:ind w:left="5040" w:hanging="360"/>
+      </w:pPr>
+      <w:rPr>
+        <w:rFonts w:ascii="Symbol" w:hAnsi="Symbol" w:hint="default"/>
+        <w:sz w:val="20"/>
+      </w:rPr>
+    </w:lvl>
+    <w:lvl w:ilvl="7" w:tentative="1">
+      <w:start w:val="1"/>
+      <w:numFmt w:val="bullet"/>
+      <w:lvlText w:val=""/>
+      <w:lvlJc w:val="left"/>
+      <w:pPr>
+        <w:tabs>
+          <w:tab w:val="num" w:pos="5760"/>
+        </w:tabs>
+        <w:ind w:left="5760" w:hanging="360"/>
+      </w:pPr>
+      <w:rPr>
+        <w:rFonts w:ascii="Symbol" w:hAnsi="Symbol" w:hint="default"/>
+        <w:sz w:val="20"/>
+      </w:rPr>
+    </w:lvl>
+    <w:lvl w:ilvl="8" w:tentative="1">
+      <w:start w:val="1"/>
+      <w:numFmt w:val="bullet"/>
+      <w:lvlText w:val=""/>
+      <w:lvlJc w:val="left"/>
+      <w:pPr>
+        <w:tabs>
+          <w:tab w:val="num" w:pos="6480"/>
+        </w:tabs>
+        <w:ind w:left="6480" w:hanging="360"/>
+      </w:pPr>
+      <w:rPr>
+        <w:rFonts w:ascii="Symbol" w:hAnsi="Symbol" w:hint="default"/>
+        <w:sz w:val="20"/>
+      </w:rPr>
+    </w:lvl>
+  </w:abstractNum>
+  <w:abstractNum w:abstractNumId="7" w15:restartNumberingAfterBreak="0">
+    <w:nsid w:val="497C4EF2"/>
+    <w:multiLevelType w:val="multilevel"/>
+    <w:tmpl w:val="BF140E3A"/>
+    <w:lvl w:ilvl="0">
+      <w:start w:val="1"/>
+      <w:numFmt w:val="bullet"/>
+      <w:lvlText w:val=""/>
+      <w:lvlJc w:val="left"/>
+      <w:pPr>
+        <w:tabs>
+          <w:tab w:val="num" w:pos="720"/>
+        </w:tabs>
+        <w:ind w:left="720" w:hanging="360"/>
+      </w:pPr>
+      <w:rPr>
+        <w:rFonts w:ascii="Symbol" w:hAnsi="Symbol" w:hint="default"/>
+        <w:sz w:val="20"/>
+      </w:rPr>
+    </w:lvl>
+    <w:lvl w:ilvl="1">
+      <w:start w:val="1"/>
+      <w:numFmt w:val="bullet"/>
+      <w:lvlText w:val=""/>
+      <w:lvlJc w:val="left"/>
+      <w:pPr>
+        <w:tabs>
+          <w:tab w:val="num" w:pos="1440"/>
+        </w:tabs>
+        <w:ind w:left="1440" w:hanging="360"/>
+      </w:pPr>
+      <w:rPr>
+        <w:rFonts w:ascii="Symbol" w:hAnsi="Symbol" w:hint="default"/>
+        <w:sz w:val="20"/>
+      </w:rPr>
+    </w:lvl>
+    <w:lvl w:ilvl="2" w:tentative="1">
+      <w:start w:val="1"/>
+      <w:numFmt w:val="bullet"/>
+      <w:lvlText w:val=""/>
+      <w:lvlJc w:val="left"/>
+      <w:pPr>
+        <w:tabs>
+          <w:tab w:val="num" w:pos="2160"/>
+        </w:tabs>
+        <w:ind w:left="2160" w:hanging="360"/>
+      </w:pPr>
+      <w:rPr>
+        <w:rFonts w:ascii="Symbol" w:hAnsi="Symbol" w:hint="default"/>
+        <w:sz w:val="20"/>
+      </w:rPr>
+    </w:lvl>
+    <w:lvl w:ilvl="3" w:tentative="1">
+      <w:start w:val="1"/>
+      <w:numFmt w:val="bullet"/>
+      <w:lvlText w:val=""/>
+      <w:lvlJc w:val="left"/>
+      <w:pPr>
+        <w:tabs>
+          <w:tab w:val="num" w:pos="2880"/>
+        </w:tabs>
+        <w:ind w:left="2880" w:hanging="360"/>
+      </w:pPr>
+      <w:rPr>
+        <w:rFonts w:ascii="Symbol" w:hAnsi="Symbol" w:hint="default"/>
+        <w:sz w:val="20"/>
+      </w:rPr>
+    </w:lvl>
+    <w:lvl w:ilvl="4" w:tentative="1">
+      <w:start w:val="1"/>
+      <w:numFmt w:val="bullet"/>
+      <w:lvlText w:val=""/>
+      <w:lvlJc w:val="left"/>
+      <w:pPr>
+        <w:tabs>
+          <w:tab w:val="num" w:pos="3600"/>
+        </w:tabs>
+        <w:ind w:left="3600" w:hanging="360"/>
+      </w:pPr>
+      <w:rPr>
+        <w:rFonts w:ascii="Symbol" w:hAnsi="Symbol" w:hint="default"/>
+        <w:sz w:val="20"/>
+      </w:rPr>
+    </w:lvl>
+    <w:lvl w:ilvl="5" w:tentative="1">
+      <w:start w:val="1"/>
+      <w:numFmt w:val="bullet"/>
+      <w:lvlText w:val=""/>
+      <w:lvlJc w:val="left"/>
+      <w:pPr>
+        <w:tabs>
+          <w:tab w:val="num" w:pos="4320"/>
+        </w:tabs>
+        <w:ind w:left="4320" w:hanging="360"/>
+      </w:pPr>
+      <w:rPr>
+        <w:rFonts w:ascii="Symbol" w:hAnsi="Symbol" w:hint="default"/>
+        <w:sz w:val="20"/>
+      </w:rPr>
+    </w:lvl>
+    <w:lvl w:ilvl="6" w:tentative="1">
+      <w:start w:val="1"/>
+      <w:numFmt w:val="bullet"/>
+      <w:lvlText w:val=""/>
+      <w:lvlJc w:val="left"/>
+      <w:pPr>
+        <w:tabs>
+          <w:tab w:val="num" w:pos="5040"/>
+        </w:tabs>
+        <w:ind w:left="5040" w:hanging="360"/>
+      </w:pPr>
+      <w:rPr>
+        <w:rFonts w:ascii="Symbol" w:hAnsi="Symbol" w:hint="default"/>
+        <w:sz w:val="20"/>
+      </w:rPr>
+    </w:lvl>
+    <w:lvl w:ilvl="7" w:tentative="1">
+      <w:start w:val="1"/>
+      <w:numFmt w:val="bullet"/>
+      <w:lvlText w:val=""/>
+      <w:lvlJc w:val="left"/>
+      <w:pPr>
+        <w:tabs>
+          <w:tab w:val="num" w:pos="5760"/>
+        </w:tabs>
+        <w:ind w:left="5760" w:hanging="360"/>
+      </w:pPr>
+      <w:rPr>
+        <w:rFonts w:ascii="Symbol" w:hAnsi="Symbol" w:hint="default"/>
+        <w:sz w:val="20"/>
+      </w:rPr>
+    </w:lvl>
+    <w:lvl w:ilvl="8" w:tentative="1">
+      <w:start w:val="1"/>
+      <w:numFmt w:val="bullet"/>
+      <w:lvlText w:val=""/>
+      <w:lvlJc w:val="left"/>
+      <w:pPr>
+        <w:tabs>
+          <w:tab w:val="num" w:pos="6480"/>
+        </w:tabs>
+        <w:ind w:left="6480" w:hanging="360"/>
+      </w:pPr>
+      <w:rPr>
+        <w:rFonts w:ascii="Symbol" w:hAnsi="Symbol" w:hint="default"/>
+        <w:sz w:val="20"/>
+      </w:rPr>
+    </w:lvl>
+  </w:abstractNum>
+  <w:abstractNum w:abstractNumId="8" w15:restartNumberingAfterBreak="0">
+    <w:nsid w:val="53F100AC"/>
+    <w:multiLevelType w:val="multilevel"/>
+    <w:tmpl w:val="C408E51A"/>
+    <w:lvl w:ilvl="0">
+      <w:start w:val="1"/>
+      <w:numFmt w:val="decimal"/>
+      <w:lvlText w:val="%1."/>
+      <w:lvlJc w:val="left"/>
+      <w:pPr>
+        <w:tabs>
+          <w:tab w:val="num" w:pos="720"/>
+        </w:tabs>
+        <w:ind w:left="720" w:hanging="360"/>
+      </w:pPr>
+    </w:lvl>
+    <w:lvl w:ilvl="1">
+      <w:start w:val="1"/>
+      <w:numFmt w:val="bullet"/>
+      <w:lvlText w:val=""/>
+      <w:lvlJc w:val="left"/>
+      <w:pPr>
+        <w:tabs>
+          <w:tab w:val="num" w:pos="1440"/>
+        </w:tabs>
+        <w:ind w:left="1440" w:hanging="360"/>
+      </w:pPr>
+      <w:rPr>
+        <w:rFonts w:ascii="Symbol" w:hAnsi="Symbol" w:hint="default"/>
+        <w:sz w:val="20"/>
+      </w:rPr>
+    </w:lvl>
+    <w:lvl w:ilvl="2" w:tentative="1">
+      <w:start w:val="1"/>
+      <w:numFmt w:val="decimal"/>
+      <w:lvlText w:val="%3."/>
+      <w:lvlJc w:val="left"/>
+      <w:pPr>
+        <w:tabs>
+          <w:tab w:val="num" w:pos="2160"/>
+        </w:tabs>
+        <w:ind w:left="2160" w:hanging="360"/>
+      </w:pPr>
+    </w:lvl>
+    <w:lvl w:ilvl="3" w:tentative="1">
+      <w:start w:val="1"/>
+      <w:numFmt w:val="decimal"/>
+      <w:lvlText w:val="%4."/>
+      <w:lvlJc w:val="left"/>
+      <w:pPr>
+        <w:tabs>
+          <w:tab w:val="num" w:pos="2880"/>
+        </w:tabs>
+        <w:ind w:left="2880" w:hanging="360"/>
+      </w:pPr>
+    </w:lvl>
+    <w:lvl w:ilvl="4" w:tentative="1">
+      <w:start w:val="1"/>
+      <w:numFmt w:val="decimal"/>
+      <w:lvlText w:val="%5."/>
+      <w:lvlJc w:val="left"/>
+      <w:pPr>
+        <w:tabs>
+          <w:tab w:val="num" w:pos="3600"/>
+        </w:tabs>
+        <w:ind w:left="3600" w:hanging="360"/>
+      </w:pPr>
+    </w:lvl>
+    <w:lvl w:ilvl="5" w:tentative="1">
+      <w:start w:val="1"/>
+      <w:numFmt w:val="decimal"/>
+      <w:lvlText w:val="%6."/>
+      <w:lvlJc w:val="left"/>
+      <w:pPr>
+        <w:tabs>
+          <w:tab w:val="num" w:pos="4320"/>
+        </w:tabs>
+        <w:ind w:left="4320" w:hanging="360"/>
+      </w:pPr>
+    </w:lvl>
+    <w:lvl w:ilvl="6" w:tentative="1">
+      <w:start w:val="1"/>
+      <w:numFmt w:val="decimal"/>
+      <w:lvlText w:val="%7."/>
+      <w:lvlJc w:val="left"/>
+      <w:pPr>
+        <w:tabs>
+          <w:tab w:val="num" w:pos="5040"/>
+        </w:tabs>
+        <w:ind w:left="5040" w:hanging="360"/>
+      </w:pPr>
+    </w:lvl>
+    <w:lvl w:ilvl="7" w:tentative="1">
+      <w:start w:val="1"/>
+      <w:numFmt w:val="decimal"/>
+      <w:lvlText w:val="%8."/>
+      <w:lvlJc w:val="left"/>
+      <w:pPr>
+        <w:tabs>
+          <w:tab w:val="num" w:pos="5760"/>
+        </w:tabs>
+        <w:ind w:left="5760" w:hanging="360"/>
+      </w:pPr>
+    </w:lvl>
+    <w:lvl w:ilvl="8" w:tentative="1">
+      <w:start w:val="1"/>
+      <w:numFmt w:val="decimal"/>
+      <w:lvlText w:val="%9."/>
+      <w:lvlJc w:val="left"/>
+      <w:pPr>
+        <w:tabs>
+          <w:tab w:val="num" w:pos="6480"/>
+        </w:tabs>
+        <w:ind w:left="6480" w:hanging="360"/>
+      </w:pPr>
+    </w:lvl>
+  </w:abstractNum>
+  <w:abstractNum w:abstractNumId="9" w15:restartNumberingAfterBreak="0">
+    <w:nsid w:val="5EFD63E2"/>
+    <w:multiLevelType w:val="multilevel"/>
+    <w:tmpl w:val="5E8462F4"/>
+    <w:lvl w:ilvl="0">
+      <w:start w:val="1"/>
+      <w:numFmt w:val="bullet"/>
+      <w:lvlText w:val=""/>
+      <w:lvlJc w:val="left"/>
+      <w:pPr>
+        <w:tabs>
+          <w:tab w:val="num" w:pos="720"/>
+        </w:tabs>
+        <w:ind w:left="720" w:hanging="360"/>
+      </w:pPr>
+      <w:rPr>
+        <w:rFonts w:ascii="Symbol" w:hAnsi="Symbol" w:hint="default"/>
+        <w:sz w:val="20"/>
+      </w:rPr>
+    </w:lvl>
+    <w:lvl w:ilvl="1">
+      <w:start w:val="1"/>
+      <w:numFmt w:val="decimal"/>
+      <w:lvlText w:val="%2."/>
+      <w:lvlJc w:val="left"/>
+      <w:pPr>
+        <w:tabs>
+          <w:tab w:val="num" w:pos="1440"/>
+        </w:tabs>
+        <w:ind w:left="1440" w:hanging="360"/>
+      </w:pPr>
+    </w:lvl>
+    <w:lvl w:ilvl="2" w:tentative="1">
+      <w:start w:val="1"/>
+      <w:numFmt w:val="bullet"/>
+      <w:lvlText w:val=""/>
+      <w:lvlJc w:val="left"/>
+      <w:pPr>
+        <w:tabs>
+          <w:tab w:val="num" w:pos="2160"/>
+        </w:tabs>
+        <w:ind w:left="2160" w:hanging="360"/>
+      </w:pPr>
+      <w:rPr>
+        <w:rFonts w:ascii="Symbol" w:hAnsi="Symbol" w:hint="default"/>
+        <w:sz w:val="20"/>
+      </w:rPr>
+    </w:lvl>
+    <w:lvl w:ilvl="3" w:tentative="1">
+      <w:start w:val="1"/>
+      <w:numFmt w:val="bullet"/>
+      <w:lvlText w:val=""/>
+      <w:lvlJc w:val="left"/>
+      <w:pPr>
+        <w:tabs>
+          <w:tab w:val="num" w:pos="2880"/>
+        </w:tabs>
+        <w:ind w:left="2880" w:hanging="360"/>
+      </w:pPr>
+      <w:rPr>
+        <w:rFonts w:ascii="Symbol" w:hAnsi="Symbol" w:hint="default"/>
+        <w:sz w:val="20"/>
+      </w:rPr>
+    </w:lvl>
+    <w:lvl w:ilvl="4" w:tentative="1">
+      <w:start w:val="1"/>
+      <w:numFmt w:val="bullet"/>
+      <w:lvlText w:val=""/>
+      <w:lvlJc w:val="left"/>
+      <w:pPr>
+        <w:tabs>
+          <w:tab w:val="num" w:pos="3600"/>
+        </w:tabs>
+        <w:ind w:left="3600" w:hanging="360"/>
+      </w:pPr>
+      <w:rPr>
+        <w:rFonts w:ascii="Symbol" w:hAnsi="Symbol" w:hint="default"/>
+        <w:sz w:val="20"/>
+      </w:rPr>
+    </w:lvl>
+    <w:lvl w:ilvl="5" w:tentative="1">
+      <w:start w:val="1"/>
+      <w:numFmt w:val="bullet"/>
+      <w:lvlText w:val=""/>
+      <w:lvlJc w:val="left"/>
+      <w:pPr>
+        <w:tabs>
+          <w:tab w:val="num" w:pos="4320"/>
+        </w:tabs>
+        <w:ind w:left="4320" w:hanging="360"/>
+      </w:pPr>
+      <w:rPr>
+        <w:rFonts w:ascii="Symbol" w:hAnsi="Symbol" w:hint="default"/>
+        <w:sz w:val="20"/>
+      </w:rPr>
+    </w:lvl>
+    <w:lvl w:ilvl="6" w:tentative="1">
+      <w:start w:val="1"/>
+      <w:numFmt w:val="bullet"/>
+      <w:lvlText w:val=""/>
+      <w:lvlJc w:val="left"/>
+      <w:pPr>
+        <w:tabs>
+          <w:tab w:val="num" w:pos="5040"/>
+        </w:tabs>
+        <w:ind w:left="5040" w:hanging="360"/>
+      </w:pPr>
+      <w:rPr>
+        <w:rFonts w:ascii="Symbol" w:hAnsi="Symbol" w:hint="default"/>
+        <w:sz w:val="20"/>
+      </w:rPr>
+    </w:lvl>
+    <w:lvl w:ilvl="7" w:tentative="1">
+      <w:start w:val="1"/>
+      <w:numFmt w:val="bullet"/>
+      <w:lvlText w:val=""/>
+      <w:lvlJc w:val="left"/>
+      <w:pPr>
+        <w:tabs>
+          <w:tab w:val="num" w:pos="5760"/>
+        </w:tabs>
+        <w:ind w:left="5760" w:hanging="360"/>
+      </w:pPr>
+      <w:rPr>
+        <w:rFonts w:ascii="Symbol" w:hAnsi="Symbol" w:hint="default"/>
+        <w:sz w:val="20"/>
+      </w:rPr>
+    </w:lvl>
+    <w:lvl w:ilvl="8" w:tentative="1">
+      <w:start w:val="1"/>
+      <w:numFmt w:val="bullet"/>
+      <w:lvlText w:val=""/>
+      <w:lvlJc w:val="left"/>
+      <w:pPr>
+        <w:tabs>
+          <w:tab w:val="num" w:pos="6480"/>
+        </w:tabs>
+        <w:ind w:left="6480" w:hanging="360"/>
+      </w:pPr>
+      <w:rPr>
+        <w:rFonts w:ascii="Symbol" w:hAnsi="Symbol" w:hint="default"/>
+        <w:sz w:val="20"/>
+      </w:rPr>
+    </w:lvl>
+  </w:abstractNum>
+  <w:abstractNum w:abstractNumId="10" w15:restartNumberingAfterBreak="0">
+    <w:nsid w:val="601254CE"/>
+    <w:multiLevelType w:val="multilevel"/>
+    <w:tmpl w:val="431611FE"/>
+    <w:lvl w:ilvl="0">
+      <w:start w:val="1"/>
+      <w:numFmt w:val="decimal"/>
+      <w:lvlText w:val="%1."/>
+      <w:lvlJc w:val="left"/>
+      <w:pPr>
+        <w:tabs>
+          <w:tab w:val="num" w:pos="720"/>
+        </w:tabs>
+        <w:ind w:left="720" w:hanging="360"/>
+      </w:pPr>
+    </w:lvl>
+    <w:lvl w:ilvl="1" w:tentative="1">
+      <w:start w:val="1"/>
+      <w:numFmt w:val="decimal"/>
+      <w:lvlText w:val="%2."/>
+      <w:lvlJc w:val="left"/>
+      <w:pPr>
+        <w:tabs>
+          <w:tab w:val="num" w:pos="1440"/>
+        </w:tabs>
+        <w:ind w:left="1440" w:hanging="360"/>
+      </w:pPr>
+    </w:lvl>
+    <w:lvl w:ilvl="2" w:tentative="1">
+      <w:start w:val="1"/>
+      <w:numFmt w:val="decimal"/>
+      <w:lvlText w:val="%3."/>
+      <w:lvlJc w:val="left"/>
+      <w:pPr>
+        <w:tabs>
+          <w:tab w:val="num" w:pos="2160"/>
+        </w:tabs>
+        <w:ind w:left="2160" w:hanging="360"/>
+      </w:pPr>
+    </w:lvl>
+    <w:lvl w:ilvl="3" w:tentative="1">
+      <w:start w:val="1"/>
+      <w:numFmt w:val="decimal"/>
+      <w:lvlText w:val="%4."/>
+      <w:lvlJc w:val="left"/>
+      <w:pPr>
+        <w:tabs>
+          <w:tab w:val="num" w:pos="2880"/>
+        </w:tabs>
+        <w:ind w:left="2880" w:hanging="360"/>
+      </w:pPr>
+    </w:lvl>
+    <w:lvl w:ilvl="4" w:tentative="1">
+      <w:start w:val="1"/>
+      <w:numFmt w:val="decimal"/>
+      <w:lvlText w:val="%5."/>
+      <w:lvlJc w:val="left"/>
+      <w:pPr>
+        <w:tabs>
+          <w:tab w:val="num" w:pos="3600"/>
+        </w:tabs>
+        <w:ind w:left="3600" w:hanging="360"/>
+      </w:pPr>
+    </w:lvl>
+    <w:lvl w:ilvl="5" w:tentative="1">
+      <w:start w:val="1"/>
+      <w:numFmt w:val="decimal"/>
+      <w:lvlText w:val="%6."/>
+      <w:lvlJc w:val="left"/>
+      <w:pPr>
+        <w:tabs>
+          <w:tab w:val="num" w:pos="4320"/>
+        </w:tabs>
+        <w:ind w:left="4320" w:hanging="360"/>
+      </w:pPr>
+    </w:lvl>
+    <w:lvl w:ilvl="6" w:tentative="1">
+      <w:start w:val="1"/>
+      <w:numFmt w:val="decimal"/>
+      <w:lvlText w:val="%7."/>
+      <w:lvlJc w:val="left"/>
+      <w:pPr>
+        <w:tabs>
+          <w:tab w:val="num" w:pos="5040"/>
+        </w:tabs>
+        <w:ind w:left="5040" w:hanging="360"/>
+      </w:pPr>
+    </w:lvl>
+    <w:lvl w:ilvl="7" w:tentative="1">
+      <w:start w:val="1"/>
+      <w:numFmt w:val="decimal"/>
+      <w:lvlText w:val="%8."/>
+      <w:lvlJc w:val="left"/>
+      <w:pPr>
+        <w:tabs>
+          <w:tab w:val="num" w:pos="5760"/>
+        </w:tabs>
+        <w:ind w:left="5760" w:hanging="360"/>
+      </w:pPr>
+    </w:lvl>
+    <w:lvl w:ilvl="8" w:tentative="1">
+      <w:start w:val="1"/>
+      <w:numFmt w:val="decimal"/>
+      <w:lvlText w:val="%9."/>
+      <w:lvlJc w:val="left"/>
+      <w:pPr>
+        <w:tabs>
+          <w:tab w:val="num" w:pos="6480"/>
+        </w:tabs>
+        <w:ind w:left="6480" w:hanging="360"/>
+      </w:pPr>
+    </w:lvl>
+  </w:abstractNum>
   <w:num w:numId="1" w16cid:durableId="1946880034">
+    <w:abstractNumId w:val="4"/>
+  </w:num>
+  <w:num w:numId="2" w16cid:durableId="157887320">
+    <w:abstractNumId w:val="5"/>
+  </w:num>
+  <w:num w:numId="3" w16cid:durableId="855121391">
+    <w:abstractNumId w:val="1"/>
+  </w:num>
+  <w:num w:numId="4" w16cid:durableId="726102035">
+    <w:abstractNumId w:val="3"/>
+  </w:num>
+  <w:num w:numId="5" w16cid:durableId="1209538432">
+    <w:abstractNumId w:val="9"/>
+  </w:num>
+  <w:num w:numId="6" w16cid:durableId="100806193">
+    <w:abstractNumId w:val="6"/>
+  </w:num>
+  <w:num w:numId="7" w16cid:durableId="435518168">
+    <w:abstractNumId w:val="7"/>
+  </w:num>
+  <w:num w:numId="8" w16cid:durableId="1385788095">
     <w:abstractNumId w:val="2"/>
   </w:num>
-  <w:num w:numId="2" w16cid:durableId="157887320">
-    <w:abstractNumId w:val="3"/>
+  <w:num w:numId="9" w16cid:durableId="1014573111">
+    <w:abstractNumId w:val="10"/>
   </w:num>
-  <w:num w:numId="3" w16cid:durableId="855121391">
+  <w:num w:numId="10" w16cid:durableId="2066294958">
     <w:abstractNumId w:val="0"/>
   </w:num>
-  <w:num w:numId="4" w16cid:durableId="726102035">
-    <w:abstractNumId w:val="1"/>
+  <w:num w:numId="11" w16cid:durableId="1571112581">
+    <w:abstractNumId w:val="8"/>
   </w:num>
 </w:numbering>
 </file>

</xml_diff>

<commit_message>
Configure stable Android Gradle 8.10 and AGP 8.7.0
</commit_message>
<xml_diff>
--- a/New Microsoft Word Document.docx
+++ b/New Microsoft Word Document.docx
@@ -3,6 +3,9 @@
 <w:document xmlns:wpc="http://schemas.microsoft.com/office/word/2010/wordprocessingCanvas" xmlns:cx="http://schemas.microsoft.com/office/drawing/2014/chartex" xmlns:cx1="http://schemas.microsoft.com/office/drawing/2015/9/8/chartex" xmlns:cx2="http://schemas.microsoft.com/office/drawing/2015/10/21/chartex" xmlns:cx3="http://schemas.microsoft.com/office/drawing/2016/5/9/chartex" xmlns:cx4="http://schemas.microsoft.com/office/drawing/2016/5/10/chartex" xmlns:cx5="http://schemas.microsoft.com/office/drawing/2016/5/11/chartex" xmlns:cx6="http://schemas.microsoft.com/office/drawing/2016/5/12/chartex" xmlns:cx7="http://schemas.microsoft.com/office/drawing/2016/5/13/chartex" xmlns:cx8="http://schemas.microsoft.com/office/drawing/2016/5/14/chartex" xmlns:mc="http://schemas.openxmlformats.org/markup-compatibility/2006" xmlns:aink="http://schemas.microsoft.com/office/drawing/2016/ink" xmlns:am3d="http://schemas.microsoft.com/office/drawing/2017/model3d" xmlns:o="urn:schemas-microsoft-com:office:office" xmlns:oel="http://schemas.microsoft.com/office/2019/extlst" xmlns:r="http://schemas.openxmlformats.org/officeDocument/2006/relationships" xmlns:m="http://schemas.openxmlformats.org/officeDocument/2006/math" xmlns:v="urn:schemas-microsoft-com:vml" xmlns:wp14="http://schemas.microsoft.com/office/word/2010/wordprocessingDrawing" xmlns:wp="http://schemas.openxmlformats.org/drawingml/2006/wordprocessingDrawing" xmlns:w10="urn:schemas-microsoft-com:office:word" xmlns:w="http://schemas.openxmlformats.org/wordprocessingml/2006/main" xmlns:w14="http://schemas.microsoft.com/office/word/2010/wordml" xmlns:w15="http://schemas.microsoft.com/office/word/2012/wordml" xmlns:w16cex="http://schemas.microsoft.com/office/word/2018/wordml/cex" xmlns:w16cid="http://schemas.microsoft.com/office/word/2016/wordml/cid" xmlns:w16="http://schemas.microsoft.com/office/word/2018/wordml" xmlns:w16du="http://schemas.microsoft.com/office/word/2023/wordml/word16du" xmlns:w16sdtdh="http://schemas.microsoft.com/office/word/2020/wordml/sdtdatahash" xmlns:w16sdtfl="http://schemas.microsoft.com/office/word/2024/wordml/sdtformatlock" xmlns:w16se="http://schemas.microsoft.com/office/word/2015/wordml/symex" xmlns:wpg="http://schemas.microsoft.com/office/word/2010/wordprocessingGroup" xmlns:wpi="http://schemas.microsoft.com/office/word/2010/wordprocessingInk" xmlns:wne="http://schemas.microsoft.com/office/word/2006/wordml" xmlns:wps="http://schemas.microsoft.com/office/word/2010/wordprocessingShape" mc:Ignorable="w14 w15 w16se w16cid w16 w16cex w16sdtdh w16sdtfl w16du wp14">
   <w:body>
     <w:p>
+      <w:pPr>
+        <w:contextualSpacing/>
+      </w:pPr>
       <w:r>
         <w:rPr>
           <w:cs/>
@@ -101,6 +104,9 @@
       </w:r>
     </w:p>
     <w:p>
+      <w:pPr>
+        <w:contextualSpacing/>
+      </w:pPr>
       <w:r>
         <w:rPr>
           <w:cs/>
@@ -109,6 +115,9 @@
       </w:r>
     </w:p>
     <w:p>
+      <w:pPr>
+        <w:contextualSpacing/>
+      </w:pPr>
       <w:r>
         <w:pict w14:anchorId="266711CC">
           <v:rect id="_x0000_i1025" style="width:403.05pt;height:.75pt" o:hrpct="0" o:hralign="center" o:hrstd="t" o:hr="t" fillcolor="#a0a0a0" stroked="f"/>
@@ -116,6 +125,9 @@
       </w:r>
     </w:p>
     <w:p>
+      <w:pPr>
+        <w:contextualSpacing/>
+      </w:pPr>
       <w:r>
         <w:rPr>
           <w:cs/>
@@ -127,6 +139,9 @@
       </w:r>
     </w:p>
     <w:p>
+      <w:pPr>
+        <w:contextualSpacing/>
+      </w:pPr>
       <w:r>
         <w:rPr>
           <w:cs/>
@@ -153,6 +168,9 @@
       </w:r>
     </w:p>
     <w:p>
+      <w:pPr>
+        <w:contextualSpacing/>
+      </w:pPr>
       <w:proofErr w:type="spellStart"/>
       <w:r>
         <w:t>AcademicYear</w:t>
@@ -172,6 +190,9 @@
       </w:r>
     </w:p>
     <w:p>
+      <w:pPr>
+        <w:contextualSpacing/>
+      </w:pPr>
       <w:r>
         <w:t xml:space="preserve">   </w:t>
       </w:r>
@@ -227,6 +248,9 @@
       </w:r>
     </w:p>
     <w:p>
+      <w:pPr>
+        <w:contextualSpacing/>
+      </w:pPr>
       <w:r>
         <w:t xml:space="preserve">          </w:t>
       </w:r>
@@ -255,6 +279,7 @@
           <w:ilvl w:val="0"/>
           <w:numId w:val="1"/>
         </w:numPr>
+        <w:contextualSpacing/>
       </w:pPr>
       <w:r>
         <w:rPr>
@@ -310,6 +335,7 @@
           <w:ilvl w:val="0"/>
           <w:numId w:val="1"/>
         </w:numPr>
+        <w:contextualSpacing/>
       </w:pPr>
       <w:r>
         <w:rPr>
@@ -348,6 +374,7 @@
           <w:ilvl w:val="0"/>
           <w:numId w:val="1"/>
         </w:numPr>
+        <w:contextualSpacing/>
       </w:pPr>
       <w:r>
         <w:rPr>
@@ -407,6 +434,9 @@
       </w:r>
     </w:p>
     <w:p>
+      <w:pPr>
+        <w:contextualSpacing/>
+      </w:pPr>
       <w:r>
         <w:pict w14:anchorId="5B228B4F">
           <v:rect id="_x0000_i1026" style="width:403.05pt;height:.75pt" o:hrpct="0" o:hralign="center" o:hrstd="t" o:hr="t" fillcolor="#a0a0a0" stroked="f"/>
@@ -414,6 +444,9 @@
       </w:r>
     </w:p>
     <w:p>
+      <w:pPr>
+        <w:contextualSpacing/>
+      </w:pPr>
       <w:r>
         <w:rPr>
           <w:cs/>
@@ -430,6 +463,7 @@
           <w:ilvl w:val="0"/>
           <w:numId w:val="2"/>
         </w:numPr>
+        <w:contextualSpacing/>
       </w:pPr>
       <w:r>
         <w:rPr>
@@ -471,6 +505,7 @@
           <w:ilvl w:val="1"/>
           <w:numId w:val="2"/>
         </w:numPr>
+        <w:contextualSpacing/>
       </w:pPr>
       <w:r>
         <w:t>student (</w:t>
@@ -488,6 +523,7 @@
           <w:ilvl w:val="1"/>
           <w:numId w:val="2"/>
         </w:numPr>
+        <w:contextualSpacing/>
       </w:pPr>
       <w:r>
         <w:t>classroom (</w:t>
@@ -516,9 +552,9 @@
           <w:ilvl w:val="1"/>
           <w:numId w:val="2"/>
         </w:numPr>
-      </w:pPr>
-      <w:r>
-        <w:lastRenderedPageBreak/>
+        <w:contextualSpacing/>
+      </w:pPr>
+      <w:r>
         <w:t>date (</w:t>
       </w:r>
       <w:r>
@@ -579,6 +615,7 @@
           <w:ilvl w:val="0"/>
           <w:numId w:val="2"/>
         </w:numPr>
+        <w:contextualSpacing/>
       </w:pPr>
       <w:r>
         <w:rPr>
@@ -596,6 +633,9 @@
       </w:r>
     </w:p>
     <w:p>
+      <w:pPr>
+        <w:contextualSpacing/>
+      </w:pPr>
       <w:r>
         <w:pict w14:anchorId="57474B7C">
           <v:rect id="_x0000_i1027" style="width:403.05pt;height:.75pt" o:hrpct="0" o:hralign="center" o:hrstd="t" o:hr="t" fillcolor="#a0a0a0" stroked="f"/>
@@ -603,10 +643,14 @@
       </w:r>
     </w:p>
     <w:p>
-      <w:r>
-        <w:rPr>
-          <w:cs/>
-        </w:rPr>
+      <w:pPr>
+        <w:contextualSpacing/>
+      </w:pPr>
+      <w:r>
+        <w:rPr>
+          <w:cs/>
+        </w:rPr>
+        <w:lastRenderedPageBreak/>
         <w:t>៣. ការរក្សាទុកហិរញ្ញវត្ថុ និងវិក្កយបត្រ (</w:t>
       </w:r>
       <w:r>
@@ -619,6 +663,7 @@
           <w:ilvl w:val="0"/>
           <w:numId w:val="3"/>
         </w:numPr>
+        <w:contextualSpacing/>
       </w:pPr>
       <w:r>
         <w:rPr>
@@ -677,6 +722,7 @@
           <w:ilvl w:val="0"/>
           <w:numId w:val="3"/>
         </w:numPr>
+        <w:contextualSpacing/>
       </w:pPr>
       <w:r>
         <w:rPr>
@@ -699,6 +745,7 @@
           <w:ilvl w:val="1"/>
           <w:numId w:val="3"/>
         </w:numPr>
+        <w:contextualSpacing/>
       </w:pPr>
       <w:r>
         <w:rPr>
@@ -713,6 +760,7 @@
           <w:ilvl w:val="1"/>
           <w:numId w:val="3"/>
         </w:numPr>
+        <w:contextualSpacing/>
       </w:pPr>
       <w:r>
         <w:rPr>
@@ -731,6 +779,9 @@
       </w:r>
     </w:p>
     <w:p>
+      <w:pPr>
+        <w:contextualSpacing/>
+      </w:pPr>
       <w:r>
         <w:pict w14:anchorId="6527C290">
           <v:rect id="_x0000_i1028" style="width:403.05pt;height:.75pt" o:hrpct="0" o:hralign="center" o:hrstd="t" o:hr="t" fillcolor="#a0a0a0" stroked="f"/>
@@ -738,6 +789,9 @@
       </w:r>
     </w:p>
     <w:p>
+      <w:pPr>
+        <w:contextualSpacing/>
+      </w:pPr>
       <w:r>
         <w:rPr>
           <w:cs/>
@@ -754,6 +808,7 @@
           <w:ilvl w:val="0"/>
           <w:numId w:val="4"/>
         </w:numPr>
+        <w:contextualSpacing/>
       </w:pPr>
       <w:r>
         <w:rPr>
@@ -827,6 +882,7 @@
           <w:ilvl w:val="0"/>
           <w:numId w:val="4"/>
         </w:numPr>
+        <w:contextualSpacing/>
       </w:pPr>
       <w:r>
         <w:rPr>
@@ -878,6 +934,9 @@
       </w:r>
     </w:p>
     <w:p>
+      <w:pPr>
+        <w:contextualSpacing/>
+      </w:pPr>
       <w:r>
         <w:pict w14:anchorId="41600B71">
           <v:rect id="_x0000_i1029" style="width:403.05pt;height:.75pt" o:hrpct="0" o:hralign="center" o:hrstd="t" o:hr="t" fillcolor="#a0a0a0" stroked="f"/>
@@ -885,6 +944,9 @@
       </w:r>
     </w:p>
     <w:p>
+      <w:pPr>
+        <w:contextualSpacing/>
+      </w:pPr>
       <w:r>
         <w:rPr>
           <w:cs/>
@@ -935,11 +997,13 @@
             <w:hideMark/>
           </w:tcPr>
           <w:p>
+            <w:pPr>
+              <w:contextualSpacing/>
+            </w:pPr>
             <w:r>
               <w:rPr>
                 <w:cs/>
               </w:rPr>
-              <w:lastRenderedPageBreak/>
               <w:t>ជំហាន</w:t>
             </w:r>
           </w:p>
@@ -957,6 +1021,9 @@
             <w:hideMark/>
           </w:tcPr>
           <w:p>
+            <w:pPr>
+              <w:contextualSpacing/>
+            </w:pPr>
             <w:r>
               <w:rPr>
                 <w:cs/>
@@ -983,6 +1050,9 @@
             <w:hideMark/>
           </w:tcPr>
           <w:p>
+            <w:pPr>
+              <w:contextualSpacing/>
+            </w:pPr>
             <w:r>
               <w:rPr>
                 <w:b/>
@@ -1006,6 +1076,9 @@
             <w:hideMark/>
           </w:tcPr>
           <w:p>
+            <w:pPr>
+              <w:contextualSpacing/>
+            </w:pPr>
             <w:r>
               <w:t xml:space="preserve">Admin </w:t>
             </w:r>
@@ -1070,6 +1143,9 @@
             <w:hideMark/>
           </w:tcPr>
           <w:p>
+            <w:pPr>
+              <w:contextualSpacing/>
+            </w:pPr>
             <w:r>
               <w:rPr>
                 <w:b/>
@@ -1093,6 +1169,9 @@
             <w:hideMark/>
           </w:tcPr>
           <w:p>
+            <w:pPr>
+              <w:contextualSpacing/>
+            </w:pPr>
             <w:r>
               <w:rPr>
                 <w:cs/>
@@ -1128,6 +1207,9 @@
             <w:hideMark/>
           </w:tcPr>
           <w:p>
+            <w:pPr>
+              <w:contextualSpacing/>
+            </w:pPr>
             <w:r>
               <w:rPr>
                 <w:b/>
@@ -1158,6 +1240,9 @@
             <w:hideMark/>
           </w:tcPr>
           <w:p>
+            <w:pPr>
+              <w:contextualSpacing/>
+            </w:pPr>
             <w:r>
               <w:rPr>
                 <w:cs/>
@@ -1203,6 +1288,9 @@
             <w:hideMark/>
           </w:tcPr>
           <w:p>
+            <w:pPr>
+              <w:contextualSpacing/>
+            </w:pPr>
             <w:r>
               <w:rPr>
                 <w:b/>
@@ -1226,6 +1314,9 @@
             <w:hideMark/>
           </w:tcPr>
           <w:p>
+            <w:pPr>
+              <w:contextualSpacing/>
+            </w:pPr>
             <w:r>
               <w:rPr>
                 <w:cs/>
@@ -1276,13 +1367,15 @@
     </w:tbl>
     <w:p>
       <w:pPr>
-        <w:rPr>
-          <w:cs/>
-        </w:rPr>
-      </w:pPr>
-    </w:p>
-    <w:p>
-      <w:pPr>
+        <w:contextualSpacing/>
+        <w:rPr>
+          <w:cs/>
+        </w:rPr>
+      </w:pPr>
+    </w:p>
+    <w:p>
+      <w:pPr>
+        <w:contextualSpacing/>
         <w:rPr>
           <w:cs/>
         </w:rPr>
@@ -1295,6 +1388,9 @@
       </w:r>
     </w:p>
     <w:p>
+      <w:pPr>
+        <w:contextualSpacing/>
+      </w:pPr>
       <w:r>
         <w:rPr>
           <w:cs/>
@@ -1369,6 +1465,9 @@
       </w:r>
     </w:p>
     <w:p>
+      <w:pPr>
+        <w:contextualSpacing/>
+      </w:pPr>
       <w:r>
         <w:pict w14:anchorId="3EE484E2">
           <v:rect id="_x0000_i1030" style="width:403.05pt;height:.75pt" o:hrpct="0" o:hralign="center" o:hrstd="t" o:hr="t" fillcolor="#a0a0a0" stroked="f"/>
@@ -1377,6 +1476,7 @@
     </w:p>
     <w:p>
       <w:pPr>
+        <w:contextualSpacing/>
         <w:rPr>
           <w:b/>
           <w:bCs/>
@@ -1399,6 +1499,9 @@
       </w:r>
     </w:p>
     <w:p>
+      <w:pPr>
+        <w:contextualSpacing/>
+      </w:pPr>
       <w:r>
         <w:t xml:space="preserve">                       </w:t>
       </w:r>
@@ -1410,6 +1513,9 @@
       </w:r>
     </w:p>
     <w:p>
+      <w:pPr>
+        <w:contextualSpacing/>
+      </w:pPr>
       <w:r>
         <w:t xml:space="preserve">                       </w:t>
       </w:r>
@@ -1448,6 +1554,9 @@
       </w:r>
     </w:p>
     <w:p>
+      <w:pPr>
+        <w:contextualSpacing/>
+      </w:pPr>
       <w:r>
         <w:t xml:space="preserve">                       </w:t>
       </w:r>
@@ -1459,6 +1568,9 @@
       </w:r>
     </w:p>
     <w:p>
+      <w:pPr>
+        <w:contextualSpacing/>
+      </w:pPr>
       <w:r>
         <w:t xml:space="preserve">      </w:t>
       </w:r>
@@ -1507,6 +1619,9 @@
       </w:r>
     </w:p>
     <w:p>
+      <w:pPr>
+        <w:contextualSpacing/>
+      </w:pPr>
       <w:r>
         <w:t xml:space="preserve">                              </w:t>
       </w:r>
@@ -1527,6 +1642,9 @@
       </w:r>
     </w:p>
     <w:p>
+      <w:pPr>
+        <w:contextualSpacing/>
+      </w:pPr>
       <w:r>
         <w:t xml:space="preserve">                       </w:t>
       </w:r>
@@ -1538,6 +1656,9 @@
       </w:r>
     </w:p>
     <w:p>
+      <w:pPr>
+        <w:contextualSpacing/>
+      </w:pPr>
       <w:r>
         <w:t xml:space="preserve">                       </w:t>
       </w:r>
@@ -1576,6 +1697,9 @@
       </w:r>
     </w:p>
     <w:p>
+      <w:pPr>
+        <w:contextualSpacing/>
+      </w:pPr>
       <w:r>
         <w:t xml:space="preserve">                       </w:t>
       </w:r>
@@ -1587,6 +1711,9 @@
       </w:r>
     </w:p>
     <w:p>
+      <w:pPr>
+        <w:contextualSpacing/>
+      </w:pPr>
       <w:r>
         <w:t xml:space="preserve">                                      </w:t>
       </w:r>
@@ -1610,6 +1737,9 @@
       </w:r>
     </w:p>
     <w:p>
+      <w:pPr>
+        <w:contextualSpacing/>
+      </w:pPr>
       <w:r>
         <w:t xml:space="preserve">                                      </w:t>
       </w:r>
@@ -1621,6 +1751,9 @@
       </w:r>
     </w:p>
     <w:p>
+      <w:pPr>
+        <w:contextualSpacing/>
+      </w:pPr>
       <w:r>
         <w:t xml:space="preserve">                       </w:t>
       </w:r>
@@ -1632,6 +1765,9 @@
       </w:r>
     </w:p>
     <w:p>
+      <w:pPr>
+        <w:contextualSpacing/>
+      </w:pPr>
       <w:r>
         <w:t xml:space="preserve">                       </w:t>
       </w:r>
@@ -1671,6 +1807,7 @@
     </w:p>
     <w:p>
       <w:pPr>
+        <w:contextualSpacing/>
         <w:rPr>
           <w:rFonts w:ascii="MS Mincho" w:eastAsia="MS Mincho" w:hAnsi="MS Mincho" w:cs="MS Mincho"/>
         </w:rPr>
@@ -1686,6 +1823,9 @@
       </w:r>
     </w:p>
     <w:p>
+      <w:pPr>
+        <w:contextualSpacing/>
+      </w:pPr>
       <w:r>
         <w:rPr>
           <w:noProof/>
@@ -1730,6 +1870,9 @@
       </w:r>
     </w:p>
     <w:p>
+      <w:pPr>
+        <w:contextualSpacing/>
+      </w:pPr>
       <w:r>
         <w:rPr>
           <w:cs/>
@@ -1755,6 +1898,7 @@
           <w:ilvl w:val="0"/>
           <w:numId w:val="5"/>
         </w:numPr>
+        <w:contextualSpacing/>
       </w:pPr>
       <w:r>
         <w:rPr>
@@ -1822,6 +1966,7 @@
           <w:ilvl w:val="0"/>
           <w:numId w:val="5"/>
         </w:numPr>
+        <w:contextualSpacing/>
       </w:pPr>
       <w:r>
         <w:rPr>
@@ -1889,6 +2034,7 @@
           <w:ilvl w:val="0"/>
           <w:numId w:val="5"/>
         </w:numPr>
+        <w:contextualSpacing/>
       </w:pPr>
       <w:r>
         <w:rPr>
@@ -1911,6 +2057,7 @@
           <w:ilvl w:val="1"/>
           <w:numId w:val="5"/>
         </w:numPr>
+        <w:contextualSpacing/>
       </w:pPr>
       <w:r>
         <w:t xml:space="preserve">Admin </w:t>
@@ -1975,6 +2122,7 @@
           <w:ilvl w:val="1"/>
           <w:numId w:val="5"/>
         </w:numPr>
+        <w:contextualSpacing/>
       </w:pPr>
       <w:r>
         <w:rPr>
@@ -2064,6 +2212,7 @@
           <w:ilvl w:val="1"/>
           <w:numId w:val="5"/>
         </w:numPr>
+        <w:contextualSpacing/>
       </w:pPr>
       <w:r>
         <w:rPr>
@@ -2135,6 +2284,9 @@
       </w:r>
     </w:p>
     <w:p>
+      <w:pPr>
+        <w:contextualSpacing/>
+      </w:pPr>
       <w:r>
         <w:pict w14:anchorId="5FCAA771">
           <v:rect id="_x0000_i1031" style="width:403.05pt;height:.75pt" o:hrpct="0" o:hralign="center" o:hrstd="t" o:hr="t" fillcolor="#a0a0a0" stroked="f"/>
@@ -2142,11 +2294,13 @@
       </w:r>
     </w:p>
     <w:p>
-      <w:r>
-        <w:rPr>
-          <w:cs/>
-        </w:rPr>
-        <w:lastRenderedPageBreak/>
+      <w:pPr>
+        <w:contextualSpacing/>
+      </w:pPr>
+      <w:r>
+        <w:rPr>
+          <w:cs/>
+        </w:rPr>
         <w:t>២. ទាញយក (</w:t>
       </w:r>
       <w:r>
@@ -2174,13 +2328,15 @@
           <w:ilvl w:val="0"/>
           <w:numId w:val="6"/>
         </w:numPr>
-      </w:pPr>
-      <w:r>
-        <w:rPr>
-          <w:b/>
-          <w:bCs/>
-          <w:cs/>
-        </w:rPr>
+        <w:contextualSpacing/>
+      </w:pPr>
+      <w:r>
+        <w:rPr>
+          <w:b/>
+          <w:bCs/>
+          <w:cs/>
+        </w:rPr>
+        <w:lastRenderedPageBreak/>
         <w:t>គោលបំណង</w:t>
       </w:r>
       <w:r>
@@ -2250,6 +2406,7 @@
           <w:ilvl w:val="0"/>
           <w:numId w:val="6"/>
         </w:numPr>
+        <w:contextualSpacing/>
       </w:pPr>
       <w:r>
         <w:rPr>
@@ -2272,6 +2429,7 @@
           <w:ilvl w:val="1"/>
           <w:numId w:val="6"/>
         </w:numPr>
+        <w:contextualSpacing/>
       </w:pPr>
       <w:r>
         <w:rPr>
@@ -2338,6 +2496,7 @@
           <w:ilvl w:val="1"/>
           <w:numId w:val="6"/>
         </w:numPr>
+        <w:contextualSpacing/>
       </w:pPr>
       <w:r>
         <w:t xml:space="preserve">Admin </w:t>
@@ -2423,6 +2582,7 @@
           <w:ilvl w:val="1"/>
           <w:numId w:val="6"/>
         </w:numPr>
+        <w:contextualSpacing/>
       </w:pPr>
       <w:r>
         <w:t xml:space="preserve">Browser </w:t>
@@ -2444,6 +2604,9 @@
       </w:r>
     </w:p>
     <w:p>
+      <w:pPr>
+        <w:contextualSpacing/>
+      </w:pPr>
       <w:r>
         <w:pict w14:anchorId="7C8695FB">
           <v:rect id="_x0000_i1032" style="width:403.05pt;height:.75pt" o:hrpct="0" o:hralign="center" o:hrstd="t" o:hr="t" fillcolor="#a0a0a0" stroked="f"/>
@@ -2451,6 +2614,9 @@
       </w:r>
     </w:p>
     <w:p>
+      <w:pPr>
+        <w:contextualSpacing/>
+      </w:pPr>
       <w:r>
         <w:rPr>
           <w:cs/>
@@ -2467,6 +2633,7 @@
           <w:ilvl w:val="0"/>
           <w:numId w:val="7"/>
         </w:numPr>
+        <w:contextualSpacing/>
       </w:pPr>
       <w:r>
         <w:rPr>
@@ -2498,6 +2665,7 @@
           <w:ilvl w:val="0"/>
           <w:numId w:val="7"/>
         </w:numPr>
+        <w:contextualSpacing/>
       </w:pPr>
       <w:r>
         <w:rPr>
@@ -2527,6 +2695,7 @@
           <w:ilvl w:val="1"/>
           <w:numId w:val="7"/>
         </w:numPr>
+        <w:contextualSpacing/>
       </w:pPr>
       <w:r>
         <w:rPr>
@@ -2623,6 +2792,7 @@
           <w:ilvl w:val="0"/>
           <w:numId w:val="7"/>
         </w:numPr>
+        <w:contextualSpacing/>
       </w:pPr>
       <w:r>
         <w:rPr>
@@ -2645,6 +2815,7 @@
           <w:ilvl w:val="1"/>
           <w:numId w:val="7"/>
         </w:numPr>
+        <w:contextualSpacing/>
       </w:pPr>
       <w:r>
         <w:rPr>
@@ -2719,14 +2890,14 @@
           <w:ilvl w:val="1"/>
           <w:numId w:val="7"/>
         </w:numPr>
-      </w:pPr>
-      <w:r>
-        <w:rPr>
-          <w:b/>
-          <w:bCs/>
-          <w:cs/>
-        </w:rPr>
-        <w:lastRenderedPageBreak/>
+        <w:contextualSpacing/>
+      </w:pPr>
+      <w:r>
+        <w:rPr>
+          <w:b/>
+          <w:bCs/>
+          <w:cs/>
+        </w:rPr>
         <w:t>ករណីទី ២ (</w:t>
       </w:r>
       <w:r>
@@ -2808,6 +2979,9 @@
       </w:r>
     </w:p>
     <w:p>
+      <w:pPr>
+        <w:contextualSpacing/>
+      </w:pPr>
       <w:r>
         <w:pict w14:anchorId="5234A8A8">
           <v:rect id="_x0000_i1033" style="width:403.05pt;height:.75pt" o:hrpct="0" o:hralign="center" o:hrstd="t" o:hr="t" fillcolor="#a0a0a0" stroked="f"/>
@@ -2816,6 +2990,7 @@
     </w:p>
     <w:p>
       <w:pPr>
+        <w:contextualSpacing/>
         <w:rPr>
           <w:b/>
           <w:bCs/>
@@ -2838,6 +3013,9 @@
       </w:r>
     </w:p>
     <w:p>
+      <w:pPr>
+        <w:contextualSpacing/>
+      </w:pPr>
       <w:r>
         <w:rPr>
           <w:cs/>
@@ -2886,12 +3064,14 @@
           <w:ilvl w:val="0"/>
           <w:numId w:val="8"/>
         </w:numPr>
-      </w:pPr>
-      <w:r>
-        <w:rPr>
-          <w:b/>
-          <w:bCs/>
-        </w:rPr>
+        <w:contextualSpacing/>
+      </w:pPr>
+      <w:r>
+        <w:rPr>
+          <w:b/>
+          <w:bCs/>
+        </w:rPr>
+        <w:lastRenderedPageBreak/>
         <w:t>Bot Token</w:t>
       </w:r>
       <w:r>
@@ -2913,6 +3093,7 @@
           <w:ilvl w:val="0"/>
           <w:numId w:val="8"/>
         </w:numPr>
+        <w:contextualSpacing/>
       </w:pPr>
       <w:r>
         <w:rPr>
@@ -2953,6 +3134,9 @@
       </w:r>
     </w:p>
     <w:p>
+      <w:pPr>
+        <w:contextualSpacing/>
+      </w:pPr>
       <w:r>
         <w:pict w14:anchorId="49371337">
           <v:rect id="_x0000_i1034" style="width:403.05pt;height:.75pt" o:hrpct="0" o:hralign="center" o:hrstd="t" o:hr="t" fillcolor="#a0a0a0" stroked="f"/>
@@ -2960,6 +3144,9 @@
       </w:r>
     </w:p>
     <w:p>
+      <w:pPr>
+        <w:contextualSpacing/>
+      </w:pPr>
       <w:r>
         <w:rPr>
           <w:cs/>
@@ -2985,6 +3172,7 @@
           <w:ilvl w:val="0"/>
           <w:numId w:val="9"/>
         </w:numPr>
+        <w:contextualSpacing/>
       </w:pPr>
       <w:r>
         <w:rPr>
@@ -3027,6 +3215,7 @@
           <w:ilvl w:val="0"/>
           <w:numId w:val="9"/>
         </w:numPr>
+        <w:contextualSpacing/>
       </w:pPr>
       <w:r>
         <w:rPr>
@@ -3068,6 +3257,7 @@
           <w:ilvl w:val="0"/>
           <w:numId w:val="9"/>
         </w:numPr>
+        <w:contextualSpacing/>
       </w:pPr>
       <w:r>
         <w:rPr>
@@ -3118,6 +3308,7 @@
           <w:ilvl w:val="0"/>
           <w:numId w:val="9"/>
         </w:numPr>
+        <w:contextualSpacing/>
       </w:pPr>
       <w:r>
         <w:rPr>
@@ -3192,6 +3383,7 @@
           <w:ilvl w:val="0"/>
           <w:numId w:val="9"/>
         </w:numPr>
+        <w:contextualSpacing/>
       </w:pPr>
       <w:r>
         <w:t>@BotFather </w:t>
@@ -3278,6 +3470,9 @@
       </w:r>
     </w:p>
     <w:p>
+      <w:pPr>
+        <w:contextualSpacing/>
+      </w:pPr>
       <w:r>
         <w:pict w14:anchorId="60E90B2E">
           <v:rect id="_x0000_i1035" style="width:403.05pt;height:.75pt" o:hrpct="0" o:hralign="center" o:hrstd="t" o:hr="t" fillcolor="#a0a0a0" stroked="f"/>
@@ -3285,6 +3480,9 @@
       </w:r>
     </w:p>
     <w:p>
+      <w:pPr>
+        <w:contextualSpacing/>
+      </w:pPr>
       <w:r>
         <w:rPr>
           <w:cs/>
@@ -3310,12 +3508,12 @@
           <w:ilvl w:val="0"/>
           <w:numId w:val="10"/>
         </w:numPr>
-      </w:pPr>
-      <w:r>
-        <w:rPr>
-          <w:cs/>
-        </w:rPr>
-        <w:lastRenderedPageBreak/>
+        <w:contextualSpacing/>
+      </w:pPr>
+      <w:r>
+        <w:rPr>
+          <w:cs/>
+        </w:rPr>
         <w:t>បង្កើត</w:t>
       </w:r>
       <w:r>
@@ -3380,6 +3578,7 @@
           <w:ilvl w:val="0"/>
           <w:numId w:val="10"/>
         </w:numPr>
+        <w:contextualSpacing/>
       </w:pPr>
       <w:r>
         <w:rPr>
@@ -3448,6 +3647,7 @@
           <w:ilvl w:val="0"/>
           <w:numId w:val="10"/>
         </w:numPr>
+        <w:contextualSpacing/>
       </w:pPr>
       <w:r>
         <w:rPr>
@@ -3490,6 +3690,7 @@
           <w:ilvl w:val="1"/>
           <w:numId w:val="10"/>
         </w:numPr>
+        <w:contextualSpacing/>
       </w:pPr>
       <w:r>
         <w:rPr>
@@ -3578,6 +3779,7 @@
           <w:ilvl w:val="1"/>
           <w:numId w:val="10"/>
         </w:numPr>
+        <w:contextualSpacing/>
       </w:pPr>
       <w:r>
         <w:rPr>
@@ -3633,6 +3835,9 @@
       </w:r>
     </w:p>
     <w:p>
+      <w:pPr>
+        <w:contextualSpacing/>
+      </w:pPr>
       <w:r>
         <w:pict w14:anchorId="675EDA9F">
           <v:rect id="_x0000_i1036" style="width:403.05pt;height:.75pt" o:hrpct="0" o:hralign="center" o:hrstd="t" o:hr="t" fillcolor="#a0a0a0" stroked="f"/>
@@ -3640,6 +3845,9 @@
       </w:r>
     </w:p>
     <w:p>
+      <w:pPr>
+        <w:contextualSpacing/>
+      </w:pPr>
       <w:r>
         <w:rPr>
           <w:cs/>
@@ -3658,6 +3866,7 @@
           <w:ilvl w:val="0"/>
           <w:numId w:val="11"/>
         </w:numPr>
+        <w:contextualSpacing/>
       </w:pPr>
       <w:r>
         <w:rPr>
@@ -3695,11 +3904,13 @@
           <w:ilvl w:val="0"/>
           <w:numId w:val="11"/>
         </w:numPr>
-      </w:pPr>
-      <w:r>
-        <w:rPr>
-          <w:cs/>
-        </w:rPr>
+        <w:contextualSpacing/>
+      </w:pPr>
+      <w:r>
+        <w:rPr>
+          <w:cs/>
+        </w:rPr>
+        <w:lastRenderedPageBreak/>
         <w:t>ចូលទៅកាន់</w:t>
       </w:r>
       <w:r>
@@ -3795,6 +4006,7 @@
           <w:ilvl w:val="0"/>
           <w:numId w:val="11"/>
         </w:numPr>
+        <w:contextualSpacing/>
       </w:pPr>
       <w:r>
         <w:rPr>
@@ -3809,6 +4021,7 @@
           <w:ilvl w:val="1"/>
           <w:numId w:val="11"/>
         </w:numPr>
+        <w:contextualSpacing/>
       </w:pPr>
       <w:r>
         <w:rPr>
@@ -3856,6 +4069,7 @@
           <w:ilvl w:val="1"/>
           <w:numId w:val="11"/>
         </w:numPr>
+        <w:contextualSpacing/>
       </w:pPr>
       <w:r>
         <w:rPr>
@@ -3901,6 +4115,7 @@
           <w:ilvl w:val="1"/>
           <w:numId w:val="11"/>
         </w:numPr>
+        <w:contextualSpacing/>
       </w:pPr>
       <w:r>
         <w:rPr>
@@ -3988,6 +4203,7 @@
           <w:ilvl w:val="0"/>
           <w:numId w:val="11"/>
         </w:numPr>
+        <w:contextualSpacing/>
       </w:pPr>
       <w:r>
         <w:rPr>
@@ -4118,11 +4334,13 @@
       </w:r>
     </w:p>
     <w:p>
+      <w:pPr>
+        <w:contextualSpacing/>
+      </w:pPr>
       <w:r>
         <w:rPr>
           <w:rFonts w:ascii="Segoe UI Emoji" w:hAnsi="Segoe UI Emoji" w:cs="Segoe UI Emoji"/>
         </w:rPr>
-        <w:lastRenderedPageBreak/>
         <w:t>📱</w:t>
       </w:r>
       <w:r>
@@ -4159,6 +4377,7 @@
           <w:ilvl w:val="0"/>
           <w:numId w:val="12"/>
         </w:numPr>
+        <w:contextualSpacing/>
       </w:pPr>
       <w:r>
         <w:rPr>
@@ -4210,6 +4429,7 @@
           <w:ilvl w:val="0"/>
           <w:numId w:val="12"/>
         </w:numPr>
+        <w:contextualSpacing/>
       </w:pPr>
       <w:r>
         <w:rPr>
@@ -4260,6 +4480,7 @@
           <w:ilvl w:val="0"/>
           <w:numId w:val="12"/>
         </w:numPr>
+        <w:contextualSpacing/>
       </w:pPr>
       <w:r>
         <w:rPr>
@@ -4302,6 +4523,7 @@
           <w:ilvl w:val="0"/>
           <w:numId w:val="12"/>
         </w:numPr>
+        <w:contextualSpacing/>
       </w:pPr>
       <w:r>
         <w:rPr>
@@ -4334,6 +4556,7 @@
           <w:ilvl w:val="0"/>
           <w:numId w:val="12"/>
         </w:numPr>
+        <w:contextualSpacing/>
       </w:pPr>
       <w:r>
         <w:rPr>
@@ -4378,7 +4601,613 @@
         <w:t>Login)</w:t>
       </w:r>
     </w:p>
-    <w:p/>
+    <w:p>
+      <w:pPr>
+        <w:contextualSpacing/>
+      </w:pPr>
+      <w:r>
+        <w:br w:type="page"/>
+      </w:r>
+    </w:p>
+    <w:p>
+      <w:pPr>
+        <w:contextualSpacing/>
+      </w:pPr>
+      <w:r>
+        <w:rPr>
+          <w:cs/>
+        </w:rPr>
+        <w:lastRenderedPageBreak/>
+        <w:t xml:space="preserve">ឯកសារ </w:t>
+      </w:r>
+      <w:r>
+        <w:t xml:space="preserve">APK </w:t>
+      </w:r>
+      <w:r>
+        <w:rPr>
+          <w:cs/>
+        </w:rPr>
+        <w:t xml:space="preserve">សម្រាប់ទូរស័ព្ទ </w:t>
+      </w:r>
+      <w:r>
+        <w:t xml:space="preserve">Android </w:t>
+      </w:r>
+      <w:r>
+        <w:rPr>
+          <w:cs/>
+        </w:rPr>
+        <w:t>អាចរកបានតាម</w:t>
+      </w:r>
+      <w:r>
+        <w:t> </w:t>
+      </w:r>
+      <w:r>
+        <w:rPr>
+          <w:b/>
+          <w:bCs/>
+          <w:cs/>
+        </w:rPr>
+        <w:t>២ ទីតាំង</w:t>
+      </w:r>
+      <w:r>
+        <w:t> </w:t>
+      </w:r>
+      <w:r>
+        <w:rPr>
+          <w:cs/>
+        </w:rPr>
+        <w:t>ដូចខាងក្រោម៖</w:t>
+      </w:r>
+    </w:p>
+    <w:p>
+      <w:pPr>
+        <w:contextualSpacing/>
+      </w:pPr>
+      <w:r>
+        <w:pict w14:anchorId="29233A7B">
+          <v:rect id="_x0000_i1055" style="width:403.05pt;height:.75pt" o:hrpct="0" o:hralign="center" o:hrstd="t" o:hr="t" fillcolor="#a0a0a0" stroked="f"/>
+        </w:pict>
+      </w:r>
+    </w:p>
+    <w:p>
+      <w:pPr>
+        <w:contextualSpacing/>
+      </w:pPr>
+      <w:r>
+        <w:rPr>
+          <w:rFonts w:ascii="Segoe UI Emoji" w:hAnsi="Segoe UI Emoji" w:cs="Segoe UI Emoji"/>
+        </w:rPr>
+        <w:t>📍</w:t>
+      </w:r>
+      <w:r>
+        <w:t xml:space="preserve"> </w:t>
+      </w:r>
+      <w:r>
+        <w:rPr>
+          <w:cs/>
+        </w:rPr>
+        <w:t>ទីតាំងទី ១៖ ទាញយក (</w:t>
+      </w:r>
+      <w:r>
+        <w:t xml:space="preserve">Download) </w:t>
+      </w:r>
+      <w:r>
+        <w:rPr>
+          <w:cs/>
+        </w:rPr>
+        <w:t xml:space="preserve">ពីលើ </w:t>
+      </w:r>
+      <w:r>
+        <w:t xml:space="preserve">Cloud </w:t>
+      </w:r>
+      <w:r>
+        <w:rPr>
+          <w:cs/>
+        </w:rPr>
+        <w:t>ដោយផ្ទាល់ (ងាយស្រួលបំផុត មិនបាច់ដំឡើងអ្វីលើកុំព្យូទ័រ)</w:t>
+      </w:r>
+    </w:p>
+    <w:p>
+      <w:pPr>
+        <w:contextualSpacing/>
+      </w:pPr>
+      <w:r>
+        <w:rPr>
+          <w:cs/>
+        </w:rPr>
+        <w:t>ខ្ញុំទើបតែបានបង្កើតប្រព័ន្ធ</w:t>
+      </w:r>
+      <w:r>
+        <w:t> </w:t>
+      </w:r>
+      <w:r>
+        <w:rPr>
+          <w:b/>
+          <w:bCs/>
+        </w:rPr>
+        <w:t>Cloud Auto-Builder (GitHub Actions)</w:t>
+      </w:r>
+      <w:r>
+        <w:t> </w:t>
+      </w:r>
+      <w:r>
+        <w:rPr>
+          <w:cs/>
+        </w:rPr>
+        <w:t xml:space="preserve">ជូនលោកអ្នករួចរាល់ហើយ! </w:t>
+      </w:r>
+      <w:r>
+        <w:t xml:space="preserve">GitHub </w:t>
+      </w:r>
+      <w:r>
+        <w:rPr>
+          <w:cs/>
+        </w:rPr>
+        <w:t xml:space="preserve">កំពុង </w:t>
+      </w:r>
+      <w:r>
+        <w:t xml:space="preserve">Compile </w:t>
+      </w:r>
+      <w:r>
+        <w:rPr>
+          <w:cs/>
+        </w:rPr>
+        <w:t xml:space="preserve">បង្កើតឯកសារ </w:t>
+      </w:r>
+      <w:r>
+        <w:t xml:space="preserve">APK </w:t>
+      </w:r>
+      <w:r>
+        <w:rPr>
+          <w:cs/>
+        </w:rPr>
+        <w:t xml:space="preserve">លើ </w:t>
+      </w:r>
+      <w:r>
+        <w:t xml:space="preserve">Cloud </w:t>
+      </w:r>
+      <w:r>
+        <w:rPr>
+          <w:cs/>
+        </w:rPr>
+        <w:t>ជូនលោកអ្នកដោយស្វ័យប្រវត្តិ៖</w:t>
+      </w:r>
+    </w:p>
+    <w:p>
+      <w:pPr>
+        <w:numPr>
+          <w:ilvl w:val="0"/>
+          <w:numId w:val="13"/>
+        </w:numPr>
+        <w:contextualSpacing/>
+      </w:pPr>
+      <w:r>
+        <w:rPr>
+          <w:cs/>
+        </w:rPr>
+        <w:t xml:space="preserve">ចូលទៅកាន់គេហទំព័រ </w:t>
+      </w:r>
+      <w:r>
+        <w:rPr>
+          <w:rFonts w:ascii="Segoe UI Emoji" w:hAnsi="Segoe UI Emoji" w:cs="Segoe UI Emoji" w:hint="cs"/>
+          <w:cs/>
+        </w:rPr>
+        <w:t>👉</w:t>
+      </w:r>
+      <w:r>
+        <w:t> </w:t>
+      </w:r>
+      <w:hyperlink r:id="rId6" w:history="1">
+        <w:r>
+          <w:rPr>
+            <w:rStyle w:val="Hyperlink"/>
+            <w:b/>
+            <w:bCs/>
+          </w:rPr>
+          <w:t>https://github.com/vannakblue/SchoolSM/actions</w:t>
+        </w:r>
+      </w:hyperlink>
+    </w:p>
+    <w:p>
+      <w:pPr>
+        <w:numPr>
+          <w:ilvl w:val="0"/>
+          <w:numId w:val="13"/>
+        </w:numPr>
+        <w:contextualSpacing/>
+      </w:pPr>
+      <w:r>
+        <w:rPr>
+          <w:cs/>
+        </w:rPr>
+        <w:t>ចុចលើដំណើរការខាងលើគេបំផុត ដែលមានឈ្មោះថា</w:t>
+      </w:r>
+      <w:r>
+        <w:t> </w:t>
+      </w:r>
+      <w:r>
+        <w:rPr>
+          <w:b/>
+          <w:bCs/>
+        </w:rPr>
+        <w:t xml:space="preserve">Build </w:t>
+      </w:r>
+      <w:proofErr w:type="spellStart"/>
+      <w:r>
+        <w:rPr>
+          <w:b/>
+          <w:bCs/>
+        </w:rPr>
+        <w:t>SchoolSM</w:t>
+      </w:r>
+      <w:proofErr w:type="spellEnd"/>
+      <w:r>
+        <w:rPr>
+          <w:b/>
+          <w:bCs/>
+        </w:rPr>
+        <w:t xml:space="preserve"> Mobile Android APK</w:t>
+      </w:r>
+    </w:p>
+    <w:p>
+      <w:pPr>
+        <w:numPr>
+          <w:ilvl w:val="0"/>
+          <w:numId w:val="13"/>
+        </w:numPr>
+        <w:contextualSpacing/>
+      </w:pPr>
+      <w:r>
+        <w:rPr>
+          <w:cs/>
+        </w:rPr>
+        <w:t>នៅពេលវាដំណើរការចប់ (ចំណាយពេលប្រហែល ២ ទៅ ៣ នាទី) សូមអូសចុះមកក្រោមត្រង់ប្រអប់</w:t>
+      </w:r>
+      <w:r>
+        <w:t> </w:t>
+      </w:r>
+      <w:r>
+        <w:rPr>
+          <w:b/>
+          <w:bCs/>
+        </w:rPr>
+        <w:t>Artifacts</w:t>
+      </w:r>
+    </w:p>
+    <w:p>
+      <w:pPr>
+        <w:numPr>
+          <w:ilvl w:val="0"/>
+          <w:numId w:val="13"/>
+        </w:numPr>
+        <w:contextualSpacing/>
+      </w:pPr>
+      <w:r>
+        <w:rPr>
+          <w:cs/>
+        </w:rPr>
+        <w:t xml:space="preserve">លោកអ្នកនឹងឃើញប៊ូតុងទាញយកឯកសារ </w:t>
+      </w:r>
+      <w:r>
+        <w:rPr>
+          <w:rFonts w:ascii="Segoe UI Emoji" w:hAnsi="Segoe UI Emoji" w:cs="Segoe UI Emoji" w:hint="cs"/>
+          <w:cs/>
+        </w:rPr>
+        <w:t>👉</w:t>
+      </w:r>
+      <w:r>
+        <w:t> </w:t>
+      </w:r>
+      <w:proofErr w:type="spellStart"/>
+      <w:r>
+        <w:rPr>
+          <w:b/>
+          <w:bCs/>
+        </w:rPr>
+        <w:t>SchoolSM</w:t>
+      </w:r>
+      <w:proofErr w:type="spellEnd"/>
+      <w:r>
+        <w:rPr>
+          <w:b/>
+          <w:bCs/>
+        </w:rPr>
+        <w:t>-Mobile-APK</w:t>
+      </w:r>
+      <w:r>
+        <w:t> </w:t>
+      </w:r>
+      <w:r>
+        <w:rPr>
+          <w:cs/>
+        </w:rPr>
+        <w:t xml:space="preserve">សម្រាប់ </w:t>
+      </w:r>
+      <w:r>
+        <w:t xml:space="preserve">Download </w:t>
+      </w:r>
+      <w:r>
+        <w:rPr>
+          <w:cs/>
+        </w:rPr>
+        <w:t xml:space="preserve">យកទៅដំឡើងលើទូរស័ព្ទដៃ </w:t>
+      </w:r>
+      <w:r>
+        <w:t xml:space="preserve">Android </w:t>
+      </w:r>
+      <w:r>
+        <w:rPr>
+          <w:cs/>
+        </w:rPr>
+        <w:t>បានភ្លាមៗ!</w:t>
+      </w:r>
+    </w:p>
+    <w:p>
+      <w:pPr>
+        <w:contextualSpacing/>
+      </w:pPr>
+      <w:r>
+        <w:pict w14:anchorId="4787379B">
+          <v:rect id="_x0000_i1056" style="width:403.05pt;height:.75pt" o:hrpct="0" o:hralign="center" o:hrstd="t" o:hr="t" fillcolor="#a0a0a0" stroked="f"/>
+        </w:pict>
+      </w:r>
+    </w:p>
+    <w:p>
+      <w:pPr>
+        <w:contextualSpacing/>
+      </w:pPr>
+      <w:r>
+        <w:rPr>
+          <w:rFonts w:ascii="Segoe UI Emoji" w:hAnsi="Segoe UI Emoji" w:cs="Segoe UI Emoji"/>
+        </w:rPr>
+        <w:t>📍</w:t>
+      </w:r>
+      <w:r>
+        <w:t xml:space="preserve"> </w:t>
+      </w:r>
+      <w:r>
+        <w:rPr>
+          <w:cs/>
+        </w:rPr>
+        <w:t>ទីតាំងទី ២៖ ទីតាំងឯកសារនៅលើកុំព្យូទ័រផ្ទាល់ខ្លួន (</w:t>
+      </w:r>
+      <w:r>
+        <w:t>Local PC)</w:t>
+      </w:r>
+    </w:p>
+    <w:p>
+      <w:pPr>
+        <w:contextualSpacing/>
+      </w:pPr>
+      <w:r>
+        <w:rPr>
+          <w:cs/>
+        </w:rPr>
+        <w:t>នៅពេលលោកអ្នកដំណើរការ</w:t>
+      </w:r>
+      <w:r>
+        <w:t> </w:t>
+      </w:r>
+      <w:r>
+        <w:rPr>
+          <w:b/>
+          <w:bCs/>
+        </w:rPr>
+        <w:t>build_android_apk.bat</w:t>
+      </w:r>
+      <w:r>
+        <w:t> (</w:t>
+      </w:r>
+      <w:r>
+        <w:rPr>
+          <w:cs/>
+        </w:rPr>
+        <w:t xml:space="preserve">បន្ទាប់ពីមានដំឡើង </w:t>
+      </w:r>
+      <w:r>
+        <w:t xml:space="preserve">Android SDK/Android Studio) </w:t>
+      </w:r>
+      <w:r>
+        <w:rPr>
+          <w:cs/>
+        </w:rPr>
+        <w:t xml:space="preserve">ឯកសារ </w:t>
+      </w:r>
+      <w:r>
+        <w:t xml:space="preserve">APK </w:t>
+      </w:r>
+      <w:r>
+        <w:rPr>
+          <w:cs/>
+        </w:rPr>
+        <w:t>នឹងស្ថិតនៅត្រង់៖</w:t>
+      </w:r>
+    </w:p>
+    <w:p>
+      <w:pPr>
+        <w:contextualSpacing/>
+      </w:pPr>
+      <w:r>
+        <w:rPr>
+          <w:rFonts w:ascii="Segoe UI Emoji" w:hAnsi="Segoe UI Emoji" w:cs="Segoe UI Emoji"/>
+        </w:rPr>
+        <w:t>👉</w:t>
+      </w:r>
+      <w:r>
+        <w:t> </w:t>
+      </w:r>
+      <w:r>
+        <w:rPr>
+          <w:b/>
+          <w:bCs/>
+        </w:rPr>
+        <w:t xml:space="preserve">Folder </w:t>
+      </w:r>
+      <w:r>
+        <w:rPr>
+          <w:b/>
+          <w:bCs/>
+          <w:cs/>
+        </w:rPr>
+        <w:t>ធំ៖</w:t>
+      </w:r>
+      <w:r>
+        <w:t> e:\SchoolSM\SchoolSM-Mobile.apk</w:t>
+      </w:r>
+      <w:r>
+        <w:br/>
+      </w:r>
+      <w:r>
+        <w:rPr>
+          <w:rFonts w:ascii="Segoe UI Emoji" w:hAnsi="Segoe UI Emoji" w:cs="Segoe UI Emoji"/>
+        </w:rPr>
+        <w:t>👉</w:t>
+      </w:r>
+      <w:r>
+        <w:t> </w:t>
+      </w:r>
+      <w:r>
+        <w:rPr>
+          <w:b/>
+          <w:bCs/>
+          <w:cs/>
+        </w:rPr>
+        <w:t xml:space="preserve">ឬ </w:t>
+      </w:r>
+      <w:r>
+        <w:rPr>
+          <w:b/>
+          <w:bCs/>
+        </w:rPr>
+        <w:t xml:space="preserve">Folder </w:t>
+      </w:r>
+      <w:r>
+        <w:rPr>
+          <w:b/>
+          <w:bCs/>
+          <w:cs/>
+        </w:rPr>
+        <w:t>ខាងក្នុង៖</w:t>
+      </w:r>
+      <w:r>
+        <w:t> e:\SchoolSM\schoolsm_mobile\build\app\outputs\flutter-apk\app-release.apk</w:t>
+      </w:r>
+    </w:p>
+    <w:p>
+      <w:pPr>
+        <w:contextualSpacing/>
+      </w:pPr>
+      <w:r>
+        <w:pict w14:anchorId="296D149E">
+          <v:rect id="_x0000_i1057" style="width:403.05pt;height:.75pt" o:hrpct="0" o:hralign="center" o:hrstd="t" o:hr="t" fillcolor="#a0a0a0" stroked="f"/>
+        </w:pict>
+      </w:r>
+    </w:p>
+    <w:p>
+      <w:pPr>
+        <w:contextualSpacing/>
+      </w:pPr>
+      <w:r>
+        <w:rPr>
+          <w:rFonts w:ascii="Segoe UI Emoji" w:hAnsi="Segoe UI Emoji" w:cs="Segoe UI Emoji"/>
+        </w:rPr>
+        <w:t>💡</w:t>
+      </w:r>
+      <w:r>
+        <w:t> </w:t>
+      </w:r>
+      <w:r>
+        <w:rPr>
+          <w:b/>
+          <w:bCs/>
+          <w:cs/>
+        </w:rPr>
+        <w:t>ការណែនាំ៖</w:t>
+      </w:r>
+      <w:r>
+        <w:br/>
+      </w:r>
+      <w:r>
+        <w:rPr>
+          <w:cs/>
+        </w:rPr>
+        <w:t xml:space="preserve">ប្រសិនបើលោកអ្នកមិនទាន់ចង់ចំណាយពេលដំឡើង </w:t>
+      </w:r>
+      <w:r>
+        <w:t xml:space="preserve">Android Studio </w:t>
+      </w:r>
+      <w:r>
+        <w:rPr>
+          <w:cs/>
+        </w:rPr>
+        <w:t>លើកុំព្យូទ័រទេ លោកអ្នកអាចចូលទៅកាន់</w:t>
+      </w:r>
+      <w:r>
+        <w:t> </w:t>
+      </w:r>
+      <w:hyperlink r:id="rId7" w:history="1">
+        <w:r>
+          <w:rPr>
+            <w:rStyle w:val="Hyperlink"/>
+            <w:b/>
+            <w:bCs/>
+          </w:rPr>
+          <w:t>GitHub Actions</w:t>
+        </w:r>
+      </w:hyperlink>
+      <w:r>
+        <w:t> </w:t>
+      </w:r>
+      <w:r>
+        <w:rPr>
+          <w:cs/>
+        </w:rPr>
+        <w:t>តាម</w:t>
+      </w:r>
+      <w:r>
+        <w:t> </w:t>
+      </w:r>
+      <w:r>
+        <w:rPr>
+          <w:b/>
+          <w:bCs/>
+          <w:cs/>
+        </w:rPr>
+        <w:t>ទីតាំងទី ១</w:t>
+      </w:r>
+      <w:r>
+        <w:t> </w:t>
+      </w:r>
+      <w:r>
+        <w:rPr>
+          <w:cs/>
+        </w:rPr>
+        <w:t xml:space="preserve">ដើម្បី </w:t>
+      </w:r>
+      <w:r>
+        <w:t xml:space="preserve">Download </w:t>
+      </w:r>
+      <w:r>
+        <w:rPr>
+          <w:cs/>
+        </w:rPr>
+        <w:t xml:space="preserve">ឯកសារ </w:t>
+      </w:r>
+      <w:r>
+        <w:t xml:space="preserve">APK </w:t>
+      </w:r>
+      <w:r>
+        <w:rPr>
+          <w:cs/>
+        </w:rPr>
+        <w:t>យកទៅប្រើប្រាស់បានភ្លាមៗ!</w:t>
+      </w:r>
+    </w:p>
+    <w:p>
+      <w:pPr>
+        <w:contextualSpacing/>
+      </w:pPr>
+    </w:p>
     <w:sectPr>
       <w:pgSz w:w="12240" w:h="15840"/>
       <w:pgMar w:top="1440" w:right="1440" w:bottom="1440" w:left="1440" w:header="720" w:footer="720" w:gutter="0"/>
@@ -4771,6 +5600,119 @@
     </w:lvl>
   </w:abstractNum>
   <w:abstractNum w:abstractNumId="3" w15:restartNumberingAfterBreak="0">
+    <w:nsid w:val="13D876B7"/>
+    <w:multiLevelType w:val="multilevel"/>
+    <w:tmpl w:val="165E7578"/>
+    <w:lvl w:ilvl="0">
+      <w:start w:val="1"/>
+      <w:numFmt w:val="decimal"/>
+      <w:lvlText w:val="%1."/>
+      <w:lvlJc w:val="left"/>
+      <w:pPr>
+        <w:tabs>
+          <w:tab w:val="num" w:pos="720"/>
+        </w:tabs>
+        <w:ind w:left="720" w:hanging="360"/>
+      </w:pPr>
+    </w:lvl>
+    <w:lvl w:ilvl="1" w:tentative="1">
+      <w:start w:val="1"/>
+      <w:numFmt w:val="decimal"/>
+      <w:lvlText w:val="%2."/>
+      <w:lvlJc w:val="left"/>
+      <w:pPr>
+        <w:tabs>
+          <w:tab w:val="num" w:pos="1440"/>
+        </w:tabs>
+        <w:ind w:left="1440" w:hanging="360"/>
+      </w:pPr>
+    </w:lvl>
+    <w:lvl w:ilvl="2" w:tentative="1">
+      <w:start w:val="1"/>
+      <w:numFmt w:val="decimal"/>
+      <w:lvlText w:val="%3."/>
+      <w:lvlJc w:val="left"/>
+      <w:pPr>
+        <w:tabs>
+          <w:tab w:val="num" w:pos="2160"/>
+        </w:tabs>
+        <w:ind w:left="2160" w:hanging="360"/>
+      </w:pPr>
+    </w:lvl>
+    <w:lvl w:ilvl="3" w:tentative="1">
+      <w:start w:val="1"/>
+      <w:numFmt w:val="decimal"/>
+      <w:lvlText w:val="%4."/>
+      <w:lvlJc w:val="left"/>
+      <w:pPr>
+        <w:tabs>
+          <w:tab w:val="num" w:pos="2880"/>
+        </w:tabs>
+        <w:ind w:left="2880" w:hanging="360"/>
+      </w:pPr>
+    </w:lvl>
+    <w:lvl w:ilvl="4" w:tentative="1">
+      <w:start w:val="1"/>
+      <w:numFmt w:val="decimal"/>
+      <w:lvlText w:val="%5."/>
+      <w:lvlJc w:val="left"/>
+      <w:pPr>
+        <w:tabs>
+          <w:tab w:val="num" w:pos="3600"/>
+        </w:tabs>
+        <w:ind w:left="3600" w:hanging="360"/>
+      </w:pPr>
+    </w:lvl>
+    <w:lvl w:ilvl="5" w:tentative="1">
+      <w:start w:val="1"/>
+      <w:numFmt w:val="decimal"/>
+      <w:lvlText w:val="%6."/>
+      <w:lvlJc w:val="left"/>
+      <w:pPr>
+        <w:tabs>
+          <w:tab w:val="num" w:pos="4320"/>
+        </w:tabs>
+        <w:ind w:left="4320" w:hanging="360"/>
+      </w:pPr>
+    </w:lvl>
+    <w:lvl w:ilvl="6" w:tentative="1">
+      <w:start w:val="1"/>
+      <w:numFmt w:val="decimal"/>
+      <w:lvlText w:val="%7."/>
+      <w:lvlJc w:val="left"/>
+      <w:pPr>
+        <w:tabs>
+          <w:tab w:val="num" w:pos="5040"/>
+        </w:tabs>
+        <w:ind w:left="5040" w:hanging="360"/>
+      </w:pPr>
+    </w:lvl>
+    <w:lvl w:ilvl="7" w:tentative="1">
+      <w:start w:val="1"/>
+      <w:numFmt w:val="decimal"/>
+      <w:lvlText w:val="%8."/>
+      <w:lvlJc w:val="left"/>
+      <w:pPr>
+        <w:tabs>
+          <w:tab w:val="num" w:pos="5760"/>
+        </w:tabs>
+        <w:ind w:left="5760" w:hanging="360"/>
+      </w:pPr>
+    </w:lvl>
+    <w:lvl w:ilvl="8" w:tentative="1">
+      <w:start w:val="1"/>
+      <w:numFmt w:val="decimal"/>
+      <w:lvlText w:val="%9."/>
+      <w:lvlJc w:val="left"/>
+      <w:pPr>
+        <w:tabs>
+          <w:tab w:val="num" w:pos="6480"/>
+        </w:tabs>
+        <w:ind w:left="6480" w:hanging="360"/>
+      </w:pPr>
+    </w:lvl>
+  </w:abstractNum>
+  <w:abstractNum w:abstractNumId="4" w15:restartNumberingAfterBreak="0">
     <w:nsid w:val="16AE35A9"/>
     <w:multiLevelType w:val="multilevel"/>
     <w:tmpl w:val="92CAB1A4"/>
@@ -4919,7 +5861,7 @@
       </w:rPr>
     </w:lvl>
   </w:abstractNum>
-  <w:abstractNum w:abstractNumId="4" w15:restartNumberingAfterBreak="0">
+  <w:abstractNum w:abstractNumId="5" w15:restartNumberingAfterBreak="0">
     <w:nsid w:val="23860A46"/>
     <w:multiLevelType w:val="multilevel"/>
     <w:tmpl w:val="A1A0DF38"/>
@@ -5068,7 +6010,7 @@
       </w:rPr>
     </w:lvl>
   </w:abstractNum>
-  <w:abstractNum w:abstractNumId="5" w15:restartNumberingAfterBreak="0">
+  <w:abstractNum w:abstractNumId="6" w15:restartNumberingAfterBreak="0">
     <w:nsid w:val="33631A50"/>
     <w:multiLevelType w:val="multilevel"/>
     <w:tmpl w:val="243A1904"/>
@@ -5217,7 +6159,7 @@
       </w:rPr>
     </w:lvl>
   </w:abstractNum>
-  <w:abstractNum w:abstractNumId="6" w15:restartNumberingAfterBreak="0">
+  <w:abstractNum w:abstractNumId="7" w15:restartNumberingAfterBreak="0">
     <w:nsid w:val="3AD54527"/>
     <w:multiLevelType w:val="multilevel"/>
     <w:tmpl w:val="4D5C29C6"/>
@@ -5362,7 +6304,7 @@
       </w:rPr>
     </w:lvl>
   </w:abstractNum>
-  <w:abstractNum w:abstractNumId="7" w15:restartNumberingAfterBreak="0">
+  <w:abstractNum w:abstractNumId="8" w15:restartNumberingAfterBreak="0">
     <w:nsid w:val="497C4EF2"/>
     <w:multiLevelType w:val="multilevel"/>
     <w:tmpl w:val="BF140E3A"/>
@@ -5511,7 +6453,7 @@
       </w:rPr>
     </w:lvl>
   </w:abstractNum>
-  <w:abstractNum w:abstractNumId="8" w15:restartNumberingAfterBreak="0">
+  <w:abstractNum w:abstractNumId="9" w15:restartNumberingAfterBreak="0">
     <w:nsid w:val="53F100AC"/>
     <w:multiLevelType w:val="multilevel"/>
     <w:tmpl w:val="C408E51A"/>
@@ -5628,7 +6570,7 @@
       </w:pPr>
     </w:lvl>
   </w:abstractNum>
-  <w:abstractNum w:abstractNumId="9" w15:restartNumberingAfterBreak="0">
+  <w:abstractNum w:abstractNumId="10" w15:restartNumberingAfterBreak="0">
     <w:nsid w:val="5EFD63E2"/>
     <w:multiLevelType w:val="multilevel"/>
     <w:tmpl w:val="5E8462F4"/>
@@ -5773,7 +6715,7 @@
       </w:rPr>
     </w:lvl>
   </w:abstractNum>
-  <w:abstractNum w:abstractNumId="10" w15:restartNumberingAfterBreak="0">
+  <w:abstractNum w:abstractNumId="11" w15:restartNumberingAfterBreak="0">
     <w:nsid w:val="601254CE"/>
     <w:multiLevelType w:val="multilevel"/>
     <w:tmpl w:val="431611FE"/>
@@ -5886,7 +6828,7 @@
       </w:pPr>
     </w:lvl>
   </w:abstractNum>
-  <w:abstractNum w:abstractNumId="11" w15:restartNumberingAfterBreak="0">
+  <w:abstractNum w:abstractNumId="12" w15:restartNumberingAfterBreak="0">
     <w:nsid w:val="727D722B"/>
     <w:multiLevelType w:val="multilevel"/>
     <w:tmpl w:val="4B821332"/>
@@ -6000,40 +6942,43 @@
     </w:lvl>
   </w:abstractNum>
   <w:num w:numId="1" w16cid:durableId="1946880034">
-    <w:abstractNumId w:val="4"/>
+    <w:abstractNumId w:val="5"/>
   </w:num>
   <w:num w:numId="2" w16cid:durableId="157887320">
-    <w:abstractNumId w:val="5"/>
+    <w:abstractNumId w:val="6"/>
   </w:num>
   <w:num w:numId="3" w16cid:durableId="855121391">
     <w:abstractNumId w:val="1"/>
   </w:num>
   <w:num w:numId="4" w16cid:durableId="726102035">
-    <w:abstractNumId w:val="3"/>
+    <w:abstractNumId w:val="4"/>
   </w:num>
   <w:num w:numId="5" w16cid:durableId="1209538432">
-    <w:abstractNumId w:val="9"/>
+    <w:abstractNumId w:val="10"/>
   </w:num>
   <w:num w:numId="6" w16cid:durableId="100806193">
-    <w:abstractNumId w:val="6"/>
+    <w:abstractNumId w:val="7"/>
   </w:num>
   <w:num w:numId="7" w16cid:durableId="435518168">
-    <w:abstractNumId w:val="7"/>
+    <w:abstractNumId w:val="8"/>
   </w:num>
   <w:num w:numId="8" w16cid:durableId="1385788095">
     <w:abstractNumId w:val="2"/>
   </w:num>
   <w:num w:numId="9" w16cid:durableId="1014573111">
-    <w:abstractNumId w:val="10"/>
+    <w:abstractNumId w:val="11"/>
   </w:num>
   <w:num w:numId="10" w16cid:durableId="2066294958">
     <w:abstractNumId w:val="0"/>
   </w:num>
   <w:num w:numId="11" w16cid:durableId="1571112581">
-    <w:abstractNumId w:val="8"/>
+    <w:abstractNumId w:val="9"/>
   </w:num>
   <w:num w:numId="12" w16cid:durableId="1403604481">
-    <w:abstractNumId w:val="11"/>
+    <w:abstractNumId w:val="12"/>
+  </w:num>
+  <w:num w:numId="13" w16cid:durableId="89476228">
+    <w:abstractNumId w:val="3"/>
   </w:num>
 </w:numbering>
 </file>
@@ -6971,6 +7916,29 @@
       <w:spacing w:val="5"/>
     </w:rPr>
   </w:style>
+  <w:style w:type="character" w:styleId="Hyperlink">
+    <w:name w:val="Hyperlink"/>
+    <w:basedOn w:val="DefaultParagraphFont"/>
+    <w:uiPriority w:val="99"/>
+    <w:unhideWhenUsed/>
+    <w:rsid w:val="00C9403D"/>
+    <w:rPr>
+      <w:color w:val="467886" w:themeColor="hyperlink"/>
+      <w:u w:val="single"/>
+    </w:rPr>
+  </w:style>
+  <w:style w:type="character" w:styleId="UnresolvedMention">
+    <w:name w:val="Unresolved Mention"/>
+    <w:basedOn w:val="DefaultParagraphFont"/>
+    <w:uiPriority w:val="99"/>
+    <w:semiHidden/>
+    <w:unhideWhenUsed/>
+    <w:rsid w:val="00C9403D"/>
+    <w:rPr>
+      <w:color w:val="605E5C"/>
+      <w:shd w:val="clear" w:color="auto" w:fill="E1DFDD"/>
+    </w:rPr>
+  </w:style>
 </w:styles>
 </file>
 

</xml_diff>